<commit_message>
Add ordered box-plot of mood dimensions with median and mean to lean Paper 1
Insert a single box-plot figure of the six BRUMS dimensions in canonical
order into the descriptive section, each box showing the median as a solid
line and the mean as a dashed line and diamond marker in the same figure.
Add a short reading of the medians, means and floor effects, and tune
figure sizes so the descriptive block stays compact.

Co-Authored-By: Claude Opus 4.8 <noreply@anthropic.com>
Claude-Session: https://claude.ai/code/session_01P7yGiDeoGDyjWvPWQVsUrj
</commit_message>
<xml_diff>
--- a/Artigos/Paper1_Humor_resumido.docx
+++ b/Artigos/Paper1_Humor_resumido.docx
@@ -1140,6 +1140,83 @@
           <w:b w:val="0"/>
           <w:sz w:val="24"/>
         </w:rPr>
+        <w:t>A Figura 1 apresenta os diagramas de caixa das seis dimensões, em ordem canônica, com a mediana e a média de cada uma na mesma figura. O vigor e a fadiga ocupam a maior parte da escala e apresentam média e mediana próximas, sinal de distribuições razoavelmente simétricas, ao passo que as dimensões negativas se concentram junto ao zero, com a média acima da mediana, o que revela assimetria positiva e um efeito de piso.</w:t>
+      </w:r>
+    </w:p>
+    <w:p>
+      <w:pPr>
+        <w:spacing w:before="120"/>
+        <w:jc w:val="center"/>
+      </w:pPr>
+      <w:r>
+        <w:drawing>
+          <wp:inline xmlns:a="http://schemas.openxmlformats.org/drawingml/2006/main" xmlns:pic="http://schemas.openxmlformats.org/drawingml/2006/picture">
+            <wp:extent cx="4680000" cy="1860000"/>
+            <wp:docPr id="1" name="Picture 1"/>
+            <wp:cNvGraphicFramePr>
+              <a:graphicFrameLocks noChangeAspect="1"/>
+            </wp:cNvGraphicFramePr>
+            <a:graphic>
+              <a:graphicData uri="http://schemas.openxmlformats.org/drawingml/2006/picture">
+                <pic:pic>
+                  <pic:nvPicPr>
+                    <pic:cNvPr id="0" name="box_humor.png"/>
+                    <pic:cNvPicPr/>
+                  </pic:nvPicPr>
+                  <pic:blipFill>
+                    <a:blip r:embed="rId9"/>
+                    <a:stretch>
+                      <a:fillRect/>
+                    </a:stretch>
+                  </pic:blipFill>
+                  <pic:spPr>
+                    <a:xfrm>
+                      <a:off x="0" y="0"/>
+                      <a:ext cx="4680000" cy="1860000"/>
+                    </a:xfrm>
+                    <a:prstGeom prst="rect"/>
+                  </pic:spPr>
+                </pic:pic>
+              </a:graphicData>
+            </a:graphic>
+          </wp:inline>
+        </w:drawing>
+      </w:r>
+    </w:p>
+    <w:p>
+      <w:pPr>
+        <w:jc w:val="center"/>
+      </w:pPr>
+      <w:r>
+        <w:rPr>
+          <w:sz w:val="22"/>
+        </w:rPr>
+        <w:t>Figura 1 – Diagramas de caixa das seis dimensões do BRUMS, em ordem canônica, com a mediana (linha sólida) e a média (linha tracejada e losango) de cada dimensão.</w:t>
+      </w:r>
+    </w:p>
+    <w:p>
+      <w:pPr>
+        <w:spacing w:after="120"/>
+        <w:jc w:val="center"/>
+      </w:pPr>
+      <w:r>
+        <w:rPr>
+          <w:sz w:val="18"/>
+        </w:rPr>
+        <w:t>Fonte: elaboração dos autores (2026).</w:t>
+      </w:r>
+    </w:p>
+    <w:p>
+      <w:pPr>
+        <w:spacing w:line="360" w:lineRule="auto" w:after="0"/>
+        <w:ind w:firstLine="709"/>
+        <w:jc w:val="both"/>
+      </w:pPr>
+      <w:r>
+        <w:rPr>
+          <w:b w:val="0"/>
+          <w:sz w:val="24"/>
+        </w:rPr>
         <w:t>A consistência interna foi adequada nas duas dimensões do eixo energia–fadiga (alfa de 0,68 para o vigor e 0,80 para a fadiga), o que reforça a confiança na sua medida. A PTH, por reunir as seis dimensões em um único índice, associou-se de forma forte ao vigor e à fadiga (correlações de 0,67 e 0,77, respectivamente), e essas duas dimensões explicaram 70% da sua variância, o que confirma o eixo energia–fadiga como o núcleo do sinal.</w:t>
       </w:r>
     </w:p>
@@ -1923,7 +2000,7 @@
           <w:b w:val="0"/>
           <w:sz w:val="24"/>
         </w:rPr>
-        <w:t>Os seis perfis de humor descritos na literatura estiveram representados na amostra. A Figura 1 apresenta cada perfil identificado no estudo em escores T, com a respectiva prevalência, o que permite reconhecer a sua forma característica. O perfil iceberg exprime prontidão, com o vigor acima da média e as dimensões negativas abaixo, ao passo que a barbatana de tubarão sinaliza pico isolado de fadiga, o submerso reúne todas as dimensões abaixo da média e o Everest invertido eleva todas as dimensões negativas (PARSONS-SMITH; TERRY; MACHIN, 2017).</w:t>
+        <w:t>Os seis perfis de humor descritos na literatura estiveram representados na amostra. A Figura 2 apresenta cada perfil identificado no estudo em escores T, com a respectiva prevalência, o que permite reconhecer a sua forma característica. O perfil iceberg exprime prontidão, com o vigor acima da média e as dimensões negativas abaixo, ao passo que a barbatana de tubarão sinaliza pico isolado de fadiga, o submerso reúne todas as dimensões abaixo da média e o Everest invertido eleva todas as dimensões negativas (PARSONS-SMITH; TERRY; MACHIN, 2017).</w:t>
       </w:r>
     </w:p>
     <w:p>
@@ -1934,8 +2011,8 @@
       <w:r>
         <w:drawing>
           <wp:inline xmlns:a="http://schemas.openxmlformats.org/drawingml/2006/main" xmlns:pic="http://schemas.openxmlformats.org/drawingml/2006/picture">
-            <wp:extent cx="5580000" cy="3035520"/>
-            <wp:docPr id="1" name="Picture 1"/>
+            <wp:extent cx="5040000" cy="2741760"/>
+            <wp:docPr id="2" name="Picture 2"/>
             <wp:cNvGraphicFramePr>
               <a:graphicFrameLocks noChangeAspect="1"/>
             </wp:cNvGraphicFramePr>
@@ -1947,7 +2024,7 @@
                     <pic:cNvPicPr/>
                   </pic:nvPicPr>
                   <pic:blipFill>
-                    <a:blip r:embed="rId9"/>
+                    <a:blip r:embed="rId10"/>
                     <a:stretch>
                       <a:fillRect/>
                     </a:stretch>
@@ -1955,7 +2032,7 @@
                   <pic:spPr>
                     <a:xfrm>
                       <a:off x="0" y="0"/>
-                      <a:ext cx="5580000" cy="3035520"/>
+                      <a:ext cx="5040000" cy="2741760"/>
                     </a:xfrm>
                     <a:prstGeom prst="rect"/>
                   </pic:spPr>
@@ -1974,7 +2051,7 @@
         <w:rPr>
           <w:sz w:val="22"/>
         </w:rPr>
-        <w:t>Figura 1 – Perfis de humor identificados na amostra, em escores T (M = 50; DP = 10) nas seis dimensões; prevalência de cada perfil entre parênteses.</w:t>
+        <w:t>Figura 2 – Perfis de humor identificados na amostra, em escores T (M = 50; DP = 10) nas seis dimensões; prevalência de cada perfil entre parênteses.</w:t>
       </w:r>
     </w:p>
     <w:p>
@@ -2000,7 +2077,7 @@
           <w:b w:val="0"/>
           <w:sz w:val="24"/>
         </w:rPr>
-        <w:t>A comparação entre o primeiro e o último dia do microciclo revelou a reconfiguração do perfil médio do grupo. A Figura 2 mostra que, no primeiro dia, o perfil assumiu o formato iceberg, com o vigor no topo e as dimensões negativas abaixo da média populacional. No último dia, o perfil inverteu-se para a forma de barbatana de tubarão, com a fadiga no topo e o vigor rebaixado, o que traduz a acumulação da carga ao longo da semana.</w:t>
+        <w:t>A comparação entre o primeiro e o último dia do microciclo revelou a reconfiguração do perfil médio do grupo. A Figura 3 mostra que, no primeiro dia, o perfil assumiu o formato iceberg, com o vigor no topo e as dimensões negativas abaixo da média populacional. No último dia, o perfil inverteu-se para a forma de barbatana de tubarão, com a fadiga no topo e o vigor rebaixado, o que traduz a acumulação da carga ao longo da semana.</w:t>
       </w:r>
     </w:p>
     <w:p>
@@ -2011,8 +2088,8 @@
       <w:r>
         <w:drawing>
           <wp:inline xmlns:a="http://schemas.openxmlformats.org/drawingml/2006/main" xmlns:pic="http://schemas.openxmlformats.org/drawingml/2006/picture">
-            <wp:extent cx="4860000" cy="2620174"/>
-            <wp:docPr id="2" name="Picture 2"/>
+            <wp:extent cx="4680000" cy="2523130"/>
+            <wp:docPr id="3" name="Picture 3"/>
             <wp:cNvGraphicFramePr>
               <a:graphicFrameLocks noChangeAspect="1"/>
             </wp:cNvGraphicFramePr>
@@ -2024,7 +2101,7 @@
                     <pic:cNvPicPr/>
                   </pic:nvPicPr>
                   <pic:blipFill>
-                    <a:blip r:embed="rId10"/>
+                    <a:blip r:embed="rId11"/>
                     <a:stretch>
                       <a:fillRect/>
                     </a:stretch>
@@ -2032,7 +2109,7 @@
                   <pic:spPr>
                     <a:xfrm>
                       <a:off x="0" y="0"/>
-                      <a:ext cx="4860000" cy="2620174"/>
+                      <a:ext cx="4680000" cy="2523130"/>
                     </a:xfrm>
                     <a:prstGeom prst="rect"/>
                   </pic:spPr>
@@ -2051,7 +2128,7 @@
         <w:rPr>
           <w:sz w:val="22"/>
         </w:rPr>
-        <w:t>Figura 2 – Perfil de humor em escores T no primeiro e no último dia do microciclo.</w:t>
+        <w:t>Figura 3 – Perfil de humor em escores T no primeiro e no último dia do microciclo.</w:t>
       </w:r>
     </w:p>
     <w:p>
@@ -6532,7 +6609,7 @@
           <w:b w:val="0"/>
           <w:sz w:val="24"/>
         </w:rPr>
-        <w:t>A Figura 3 ilustra a trajetória do vigor, da fadiga e da PTH ao longo da semana, com a queda progressiva do vigor e a elevação da fadiga e da PTH em direção ao fim do microciclo.</w:t>
+        <w:t>A Figura 4 ilustra a trajetória do vigor, da fadiga e da PTH ao longo da semana, com a queda progressiva do vigor e a elevação da fadiga e da PTH em direção ao fim do microciclo.</w:t>
       </w:r>
     </w:p>
     <w:p>
@@ -6543,8 +6620,8 @@
       <w:r>
         <w:drawing>
           <wp:inline xmlns:a="http://schemas.openxmlformats.org/drawingml/2006/main" xmlns:pic="http://schemas.openxmlformats.org/drawingml/2006/picture">
-            <wp:extent cx="5580000" cy="3138750"/>
-            <wp:docPr id="3" name="Picture 3"/>
+            <wp:extent cx="5220000" cy="2936250"/>
+            <wp:docPr id="4" name="Picture 4"/>
             <wp:cNvGraphicFramePr>
               <a:graphicFrameLocks noChangeAspect="1"/>
             </wp:cNvGraphicFramePr>
@@ -6556,7 +6633,7 @@
                     <pic:cNvPicPr/>
                   </pic:nvPicPr>
                   <pic:blipFill>
-                    <a:blip r:embed="rId11"/>
+                    <a:blip r:embed="rId12"/>
                     <a:stretch>
                       <a:fillRect/>
                     </a:stretch>
@@ -6564,7 +6641,7 @@
                   <pic:spPr>
                     <a:xfrm>
                       <a:off x="0" y="0"/>
-                      <a:ext cx="5580000" cy="3138750"/>
+                      <a:ext cx="5220000" cy="2936250"/>
                     </a:xfrm>
                     <a:prstGeom prst="rect"/>
                   </pic:spPr>
@@ -6583,7 +6660,7 @@
         <w:rPr>
           <w:sz w:val="22"/>
         </w:rPr>
-        <w:t>Figura 3 – Trajetória de vigor, fadiga e perturbação total do humor ao longo dos sete dias.</w:t>
+        <w:t>Figura 4 – Trajetória de vigor, fadiga e perturbação total do humor ao longo dos sete dias.</w:t>
       </w:r>
     </w:p>
     <w:p>
@@ -8055,8 +8132,8 @@
       <w:r>
         <w:drawing>
           <wp:inline xmlns:a="http://schemas.openxmlformats.org/drawingml/2006/main" xmlns:pic="http://schemas.openxmlformats.org/drawingml/2006/picture">
-            <wp:extent cx="5580000" cy="3138750"/>
-            <wp:docPr id="4" name="Picture 4"/>
+            <wp:extent cx="5220000" cy="2936250"/>
+            <wp:docPr id="5" name="Picture 5"/>
             <wp:cNvGraphicFramePr>
               <a:graphicFrameLocks noChangeAspect="1"/>
             </wp:cNvGraphicFramePr>
@@ -8068,7 +8145,7 @@
                     <pic:cNvPicPr/>
                   </pic:nvPicPr>
                   <pic:blipFill>
-                    <a:blip r:embed="rId12"/>
+                    <a:blip r:embed="rId13"/>
                     <a:stretch>
                       <a:fillRect/>
                     </a:stretch>
@@ -8076,7 +8153,7 @@
                   <pic:spPr>
                     <a:xfrm>
                       <a:off x="0" y="0"/>
-                      <a:ext cx="5580000" cy="3138750"/>
+                      <a:ext cx="5220000" cy="2936250"/>
                     </a:xfrm>
                     <a:prstGeom prst="rect"/>
                   </pic:spPr>
@@ -8095,7 +8172,7 @@
         <w:rPr>
           <w:sz w:val="22"/>
         </w:rPr>
-        <w:t>Figura 4 – Escores de vigor, fadiga e perturbação total do humor no pré e no pós-treino, por dia.</w:t>
+        <w:t>Figura 5 – Escores de vigor, fadiga e perturbação total do humor no pré e no pós-treino, por dia.</w:t>
       </w:r>
     </w:p>
     <w:p>
@@ -8793,7 +8870,7 @@
     </w:p>
     <w:p>
       <w:pPr>
-        <w:spacing w:before="200" w:after="80" w:line="360" w:lineRule="auto"/>
+        <w:spacing w:before="120" w:after="80" w:line="360" w:lineRule="auto"/>
       </w:pPr>
       <w:r>
         <w:rPr>
@@ -8805,7 +8882,7 @@
     </w:p>
     <w:p>
       <w:pPr>
-        <w:spacing w:line="360" w:lineRule="auto" w:after="120"/>
+        <w:spacing w:line="312" w:lineRule="auto" w:after="80"/>
         <w:jc w:val="both"/>
       </w:pPr>
       <w:r>
@@ -8817,7 +8894,7 @@
     </w:p>
     <w:p>
       <w:pPr>
-        <w:spacing w:line="360" w:lineRule="auto" w:after="120"/>
+        <w:spacing w:line="312" w:lineRule="auto" w:after="80"/>
         <w:jc w:val="both"/>
       </w:pPr>
       <w:r>
@@ -8829,7 +8906,7 @@
     </w:p>
     <w:p>
       <w:pPr>
-        <w:spacing w:line="360" w:lineRule="auto" w:after="120"/>
+        <w:spacing w:line="312" w:lineRule="auto" w:after="80"/>
         <w:jc w:val="both"/>
       </w:pPr>
       <w:r>
@@ -8841,7 +8918,7 @@
     </w:p>
     <w:p>
       <w:pPr>
-        <w:spacing w:line="360" w:lineRule="auto" w:after="120"/>
+        <w:spacing w:line="312" w:lineRule="auto" w:after="80"/>
         <w:jc w:val="both"/>
       </w:pPr>
       <w:r>
@@ -8853,7 +8930,7 @@
     </w:p>
     <w:p>
       <w:pPr>
-        <w:spacing w:line="360" w:lineRule="auto" w:after="120"/>
+        <w:spacing w:line="312" w:lineRule="auto" w:after="80"/>
         <w:jc w:val="both"/>
       </w:pPr>
       <w:r>
@@ -8865,7 +8942,7 @@
     </w:p>
     <w:p>
       <w:pPr>
-        <w:spacing w:line="360" w:lineRule="auto" w:after="120"/>
+        <w:spacing w:line="312" w:lineRule="auto" w:after="80"/>
         <w:jc w:val="both"/>
       </w:pPr>
       <w:r>
@@ -8877,7 +8954,7 @@
     </w:p>
     <w:p>
       <w:pPr>
-        <w:spacing w:line="360" w:lineRule="auto" w:after="120"/>
+        <w:spacing w:line="312" w:lineRule="auto" w:after="80"/>
         <w:jc w:val="both"/>
       </w:pPr>
       <w:r>
@@ -8889,7 +8966,7 @@
     </w:p>
     <w:p>
       <w:pPr>
-        <w:spacing w:line="360" w:lineRule="auto" w:after="120"/>
+        <w:spacing w:line="312" w:lineRule="auto" w:after="80"/>
         <w:jc w:val="both"/>
       </w:pPr>
       <w:r>
@@ -8901,7 +8978,7 @@
     </w:p>
     <w:p>
       <w:pPr>
-        <w:spacing w:line="360" w:lineRule="auto" w:after="120"/>
+        <w:spacing w:line="312" w:lineRule="auto" w:after="80"/>
         <w:jc w:val="both"/>
       </w:pPr>
       <w:r>
@@ -8913,7 +8990,7 @@
     </w:p>
     <w:p>
       <w:pPr>
-        <w:spacing w:line="360" w:lineRule="auto" w:after="120"/>
+        <w:spacing w:line="312" w:lineRule="auto" w:after="80"/>
         <w:jc w:val="both"/>
       </w:pPr>
       <w:r>
@@ -8925,7 +9002,7 @@
     </w:p>
     <w:p>
       <w:pPr>
-        <w:spacing w:line="360" w:lineRule="auto" w:after="120"/>
+        <w:spacing w:line="312" w:lineRule="auto" w:after="80"/>
         <w:jc w:val="both"/>
       </w:pPr>
       <w:r>
@@ -8937,7 +9014,7 @@
     </w:p>
     <w:p>
       <w:pPr>
-        <w:spacing w:line="360" w:lineRule="auto" w:after="120"/>
+        <w:spacing w:line="312" w:lineRule="auto" w:after="80"/>
         <w:jc w:val="both"/>
       </w:pPr>
       <w:r>
@@ -8949,7 +9026,7 @@
     </w:p>
     <w:p>
       <w:pPr>
-        <w:spacing w:line="360" w:lineRule="auto" w:after="120"/>
+        <w:spacing w:line="312" w:lineRule="auto" w:after="80"/>
         <w:jc w:val="both"/>
       </w:pPr>
       <w:r>
@@ -8961,7 +9038,7 @@
     </w:p>
     <w:p>
       <w:pPr>
-        <w:spacing w:line="360" w:lineRule="auto" w:after="120"/>
+        <w:spacing w:line="312" w:lineRule="auto" w:after="80"/>
         <w:jc w:val="both"/>
       </w:pPr>
       <w:r>
@@ -8973,7 +9050,7 @@
     </w:p>
     <w:p>
       <w:pPr>
-        <w:spacing w:line="360" w:lineRule="auto" w:after="120"/>
+        <w:spacing w:line="312" w:lineRule="auto" w:after="80"/>
         <w:jc w:val="both"/>
       </w:pPr>
       <w:r>
@@ -8985,7 +9062,7 @@
     </w:p>
     <w:p>
       <w:pPr>
-        <w:spacing w:line="360" w:lineRule="auto" w:after="120"/>
+        <w:spacing w:line="312" w:lineRule="auto" w:after="80"/>
         <w:jc w:val="both"/>
       </w:pPr>
       <w:r>
@@ -8997,7 +9074,7 @@
     </w:p>
     <w:p>
       <w:pPr>
-        <w:spacing w:line="360" w:lineRule="auto" w:after="120"/>
+        <w:spacing w:line="312" w:lineRule="auto" w:after="80"/>
         <w:jc w:val="both"/>
       </w:pPr>
       <w:r>
@@ -9009,7 +9086,7 @@
     </w:p>
     <w:p>
       <w:pPr>
-        <w:spacing w:line="360" w:lineRule="auto" w:after="120"/>
+        <w:spacing w:line="312" w:lineRule="auto" w:after="80"/>
         <w:jc w:val="both"/>
       </w:pPr>
       <w:r>
@@ -9021,7 +9098,7 @@
     </w:p>
     <w:p>
       <w:pPr>
-        <w:spacing w:line="360" w:lineRule="auto" w:after="120"/>
+        <w:spacing w:line="312" w:lineRule="auto" w:after="80"/>
         <w:jc w:val="both"/>
       </w:pPr>
       <w:r>
@@ -9033,7 +9110,7 @@
     </w:p>
     <w:p>
       <w:pPr>
-        <w:spacing w:line="360" w:lineRule="auto" w:after="120"/>
+        <w:spacing w:line="312" w:lineRule="auto" w:after="80"/>
         <w:jc w:val="both"/>
       </w:pPr>
       <w:r>
@@ -9045,7 +9122,7 @@
     </w:p>
     <w:p>
       <w:pPr>
-        <w:spacing w:line="360" w:lineRule="auto" w:after="120"/>
+        <w:spacing w:line="312" w:lineRule="auto" w:after="80"/>
         <w:jc w:val="both"/>
       </w:pPr>
       <w:r>

</xml_diff>

<commit_message>
Expand lean Paper 1 to fifteen pages with measurement error and post-hoc detail
Add a measurement-error table (SEM, minimal detectable change and smallest
worthwhile change) to the descriptive section, a peak-days table, a
post-hoc table of daily estimated marginal means compared to day one with
its figure, and a per-day box-plot of the six dimensions. Renumber the
results into seven subsections and keep every check clean.

Co-Authored-By: Claude Opus 4.8 <noreply@anthropic.com>
Claude-Session: https://claude.ai/code/session_01P7yGiDeoGDyjWvPWQVsUrj
</commit_message>
<xml_diff>
--- a/Artigos/Paper1_Humor_resumido.docx
+++ b/Artigos/Paper1_Humor_resumido.docx
@@ -1979,6 +1979,445 @@
     </w:p>
     <w:p>
       <w:pPr>
+        <w:spacing w:line="360" w:lineRule="auto" w:after="0"/>
+        <w:ind w:firstLine="709"/>
+        <w:jc w:val="both"/>
+      </w:pPr>
+      <w:r>
+        <w:rPr>
+          <w:b w:val="0"/>
+          <w:sz w:val="24"/>
+        </w:rPr>
+        <w:t>A partir do ICC derivaram-se os limiares de mudança das duas dimensões do eixo energia–fadiga (Tabela 3), úteis para separar a variação real do ruído de medida. No vigor, o erro-padrão de medida foi de 2,3 ponto e a mudança mínima detectável, de 5,3 (90%) a 6,3 (95%) pontos; na fadiga, de 2,5 e de 5,9 a 7,0 pontos, respectivamente. Esses valores superam a menor mudança relevante (SWC = 0,5 no vigor e 0,6 na fadiga), o que indica que, no plano individual, apenas oscilações de cerca de 5,3 a 5,9 pontos podem ser lidas como mudança real, ao passo que variações menores se confundem com o ruído. Por esse motivo, a interpretação deste estudo apoia-se nas tendências de grupo e não em leituras isoladas por atleta.</w:t>
+      </w:r>
+    </w:p>
+    <w:p>
+      <w:pPr>
+        <w:spacing w:before="160" w:after="40"/>
+      </w:pPr>
+      <w:r>
+        <w:rPr>
+          <w:sz w:val="22"/>
+        </w:rPr>
+        <w:t>Tabela 3 – Erro de medida e limiares de mudança do vigor e da fadiga (escala 0–16): erro-padrão de medida (SEM), mudança mínima detectável (MDC) e menor mudança relevante (SWC).</w:t>
+      </w:r>
+    </w:p>
+    <w:tbl>
+      <w:tblPr>
+        <w:tblW w:type="auto" w:w="0"/>
+        <w:jc w:val="center"/>
+        <w:tblLayout w:type="fixed"/>
+        <w:tblLook w:firstColumn="1" w:firstRow="1" w:lastColumn="0" w:lastRow="0" w:noHBand="0" w:noVBand="1" w:val="04A0"/>
+        <w:tblLayout w:type="fixed"/>
+        <w:tblCellMar>
+          <w:left w:w="40" w:type="dxa"/>
+          <w:right w:w="40" w:type="dxa"/>
+        </w:tblCellMar>
+      </w:tblPr>
+      <w:tblGrid>
+        <w:gridCol w:w="1701"/>
+        <w:gridCol w:w="1842"/>
+        <w:gridCol w:w="1842"/>
+        <w:gridCol w:w="1842"/>
+        <w:gridCol w:w="1842"/>
+      </w:tblGrid>
+      <w:tr>
+        <w:tc>
+          <w:tcPr>
+            <w:tcW w:type="dxa" w:w="1701"/>
+            <w:tcBorders>
+              <w:top w:val="single" w:sz="6" w:color="000000"/>
+              <w:bottom w:val="single" w:sz="6" w:color="000000"/>
+              <w:left w:val="nil" w:sz="6" w:color="000000"/>
+              <w:right w:val="nil" w:sz="6" w:color="000000"/>
+            </w:tcBorders>
+          </w:tcPr>
+          <w:p>
+            <w:pPr>
+              <w:jc w:val="center"/>
+            </w:pPr>
+            <w:r/>
+            <w:r>
+              <w:rPr>
+                <w:rFonts w:ascii="Times New Roman" w:hAnsi="Times New Roman"/>
+                <w:b/>
+                <w:sz w:val="18"/>
+              </w:rPr>
+              <w:t>Dimensão</w:t>
+            </w:r>
+          </w:p>
+        </w:tc>
+        <w:tc>
+          <w:tcPr>
+            <w:tcW w:type="dxa" w:w="1843"/>
+            <w:tcBorders>
+              <w:top w:val="single" w:sz="6" w:color="000000"/>
+              <w:bottom w:val="single" w:sz="6" w:color="000000"/>
+              <w:left w:val="nil" w:sz="6" w:color="000000"/>
+              <w:right w:val="nil" w:sz="6" w:color="000000"/>
+            </w:tcBorders>
+          </w:tcPr>
+          <w:p>
+            <w:pPr>
+              <w:jc w:val="center"/>
+            </w:pPr>
+            <w:r/>
+            <w:r>
+              <w:rPr>
+                <w:rFonts w:ascii="Times New Roman" w:hAnsi="Times New Roman"/>
+                <w:b/>
+                <w:sz w:val="18"/>
+              </w:rPr>
+              <w:t>SEM</w:t>
+            </w:r>
+          </w:p>
+        </w:tc>
+        <w:tc>
+          <w:tcPr>
+            <w:tcW w:type="dxa" w:w="1843"/>
+            <w:tcBorders>
+              <w:top w:val="single" w:sz="6" w:color="000000"/>
+              <w:bottom w:val="single" w:sz="6" w:color="000000"/>
+              <w:left w:val="nil" w:sz="6" w:color="000000"/>
+              <w:right w:val="nil" w:sz="6" w:color="000000"/>
+            </w:tcBorders>
+          </w:tcPr>
+          <w:p>
+            <w:pPr>
+              <w:jc w:val="center"/>
+            </w:pPr>
+            <w:r/>
+            <w:r>
+              <w:rPr>
+                <w:rFonts w:ascii="Times New Roman" w:hAnsi="Times New Roman"/>
+                <w:b/>
+                <w:sz w:val="18"/>
+              </w:rPr>
+              <w:t>MDC90</w:t>
+            </w:r>
+          </w:p>
+        </w:tc>
+        <w:tc>
+          <w:tcPr>
+            <w:tcW w:type="dxa" w:w="1843"/>
+            <w:tcBorders>
+              <w:top w:val="single" w:sz="6" w:color="000000"/>
+              <w:bottom w:val="single" w:sz="6" w:color="000000"/>
+              <w:left w:val="nil" w:sz="6" w:color="000000"/>
+              <w:right w:val="nil" w:sz="6" w:color="000000"/>
+            </w:tcBorders>
+          </w:tcPr>
+          <w:p>
+            <w:pPr>
+              <w:jc w:val="center"/>
+            </w:pPr>
+            <w:r/>
+            <w:r>
+              <w:rPr>
+                <w:rFonts w:ascii="Times New Roman" w:hAnsi="Times New Roman"/>
+                <w:b/>
+                <w:sz w:val="18"/>
+              </w:rPr>
+              <w:t>MDC95</w:t>
+            </w:r>
+          </w:p>
+        </w:tc>
+        <w:tc>
+          <w:tcPr>
+            <w:tcW w:type="dxa" w:w="1843"/>
+            <w:tcBorders>
+              <w:top w:val="single" w:sz="6" w:color="000000"/>
+              <w:bottom w:val="single" w:sz="6" w:color="000000"/>
+              <w:left w:val="nil" w:sz="6" w:color="000000"/>
+              <w:right w:val="nil" w:sz="6" w:color="000000"/>
+            </w:tcBorders>
+          </w:tcPr>
+          <w:p>
+            <w:pPr>
+              <w:jc w:val="center"/>
+            </w:pPr>
+            <w:r/>
+            <w:r>
+              <w:rPr>
+                <w:rFonts w:ascii="Times New Roman" w:hAnsi="Times New Roman"/>
+                <w:b/>
+                <w:sz w:val="18"/>
+              </w:rPr>
+              <w:t>SWC</w:t>
+            </w:r>
+          </w:p>
+        </w:tc>
+      </w:tr>
+      <w:tr>
+        <w:tc>
+          <w:tcPr>
+            <w:tcW w:type="dxa" w:w="1701"/>
+            <w:tcBorders>
+              <w:top w:val="single" w:sz="6" w:color="000000"/>
+              <w:bottom w:val="single" w:sz="6" w:color="000000"/>
+              <w:left w:val="nil" w:sz="6" w:color="000000"/>
+              <w:right w:val="nil" w:sz="6" w:color="000000"/>
+            </w:tcBorders>
+          </w:tcPr>
+          <w:p>
+            <w:pPr>
+              <w:jc w:val="left"/>
+            </w:pPr>
+            <w:r/>
+            <w:r>
+              <w:rPr>
+                <w:rFonts w:ascii="Times New Roman" w:hAnsi="Times New Roman"/>
+                <w:sz w:val="18"/>
+              </w:rPr>
+              <w:t>Vigor</w:t>
+            </w:r>
+          </w:p>
+        </w:tc>
+        <w:tc>
+          <w:tcPr>
+            <w:tcW w:type="dxa" w:w="1843"/>
+            <w:tcBorders>
+              <w:top w:val="single" w:sz="6" w:color="000000"/>
+              <w:bottom w:val="single" w:sz="6" w:color="000000"/>
+              <w:left w:val="nil" w:sz="6" w:color="000000"/>
+              <w:right w:val="nil" w:sz="6" w:color="000000"/>
+            </w:tcBorders>
+          </w:tcPr>
+          <w:p>
+            <w:pPr>
+              <w:jc w:val="center"/>
+            </w:pPr>
+            <w:r/>
+            <w:r>
+              <w:rPr>
+                <w:rFonts w:ascii="Times New Roman" w:hAnsi="Times New Roman"/>
+                <w:sz w:val="18"/>
+              </w:rPr>
+              <w:t>2,3</w:t>
+            </w:r>
+          </w:p>
+        </w:tc>
+        <w:tc>
+          <w:tcPr>
+            <w:tcW w:type="dxa" w:w="1843"/>
+            <w:tcBorders>
+              <w:top w:val="single" w:sz="6" w:color="000000"/>
+              <w:bottom w:val="single" w:sz="6" w:color="000000"/>
+              <w:left w:val="nil" w:sz="6" w:color="000000"/>
+              <w:right w:val="nil" w:sz="6" w:color="000000"/>
+            </w:tcBorders>
+          </w:tcPr>
+          <w:p>
+            <w:pPr>
+              <w:jc w:val="center"/>
+            </w:pPr>
+            <w:r/>
+            <w:r>
+              <w:rPr>
+                <w:rFonts w:ascii="Times New Roman" w:hAnsi="Times New Roman"/>
+                <w:sz w:val="18"/>
+              </w:rPr>
+              <w:t>5,3</w:t>
+            </w:r>
+          </w:p>
+        </w:tc>
+        <w:tc>
+          <w:tcPr>
+            <w:tcW w:type="dxa" w:w="1843"/>
+            <w:tcBorders>
+              <w:top w:val="single" w:sz="6" w:color="000000"/>
+              <w:bottom w:val="single" w:sz="6" w:color="000000"/>
+              <w:left w:val="nil" w:sz="6" w:color="000000"/>
+              <w:right w:val="nil" w:sz="6" w:color="000000"/>
+            </w:tcBorders>
+          </w:tcPr>
+          <w:p>
+            <w:pPr>
+              <w:jc w:val="center"/>
+            </w:pPr>
+            <w:r/>
+            <w:r>
+              <w:rPr>
+                <w:rFonts w:ascii="Times New Roman" w:hAnsi="Times New Roman"/>
+                <w:sz w:val="18"/>
+              </w:rPr>
+              <w:t>6,3</w:t>
+            </w:r>
+          </w:p>
+        </w:tc>
+        <w:tc>
+          <w:tcPr>
+            <w:tcW w:type="dxa" w:w="1843"/>
+            <w:tcBorders>
+              <w:top w:val="single" w:sz="6" w:color="000000"/>
+              <w:bottom w:val="single" w:sz="6" w:color="000000"/>
+              <w:left w:val="nil" w:sz="6" w:color="000000"/>
+              <w:right w:val="nil" w:sz="6" w:color="000000"/>
+            </w:tcBorders>
+          </w:tcPr>
+          <w:p>
+            <w:pPr>
+              <w:jc w:val="center"/>
+            </w:pPr>
+            <w:r/>
+            <w:r>
+              <w:rPr>
+                <w:rFonts w:ascii="Times New Roman" w:hAnsi="Times New Roman"/>
+                <w:sz w:val="18"/>
+              </w:rPr>
+              <w:t>0,5</w:t>
+            </w:r>
+          </w:p>
+        </w:tc>
+      </w:tr>
+      <w:tr>
+        <w:tc>
+          <w:tcPr>
+            <w:tcW w:type="dxa" w:w="1701"/>
+            <w:tcBorders>
+              <w:top w:val="single" w:sz="6" w:color="000000"/>
+              <w:bottom w:val="single" w:sz="6" w:color="000000"/>
+              <w:left w:val="nil" w:sz="6" w:color="000000"/>
+              <w:right w:val="nil" w:sz="6" w:color="000000"/>
+            </w:tcBorders>
+          </w:tcPr>
+          <w:p>
+            <w:pPr>
+              <w:jc w:val="left"/>
+            </w:pPr>
+            <w:r/>
+            <w:r>
+              <w:rPr>
+                <w:rFonts w:ascii="Times New Roman" w:hAnsi="Times New Roman"/>
+                <w:sz w:val="18"/>
+              </w:rPr>
+              <w:t>Fadiga</w:t>
+            </w:r>
+          </w:p>
+        </w:tc>
+        <w:tc>
+          <w:tcPr>
+            <w:tcW w:type="dxa" w:w="1843"/>
+            <w:tcBorders>
+              <w:top w:val="single" w:sz="6" w:color="000000"/>
+              <w:bottom w:val="single" w:sz="6" w:color="000000"/>
+              <w:left w:val="nil" w:sz="6" w:color="000000"/>
+              <w:right w:val="nil" w:sz="6" w:color="000000"/>
+            </w:tcBorders>
+          </w:tcPr>
+          <w:p>
+            <w:pPr>
+              <w:jc w:val="center"/>
+            </w:pPr>
+            <w:r/>
+            <w:r>
+              <w:rPr>
+                <w:rFonts w:ascii="Times New Roman" w:hAnsi="Times New Roman"/>
+                <w:sz w:val="18"/>
+              </w:rPr>
+              <w:t>2,5</w:t>
+            </w:r>
+          </w:p>
+        </w:tc>
+        <w:tc>
+          <w:tcPr>
+            <w:tcW w:type="dxa" w:w="1843"/>
+            <w:tcBorders>
+              <w:top w:val="single" w:sz="6" w:color="000000"/>
+              <w:bottom w:val="single" w:sz="6" w:color="000000"/>
+              <w:left w:val="nil" w:sz="6" w:color="000000"/>
+              <w:right w:val="nil" w:sz="6" w:color="000000"/>
+            </w:tcBorders>
+          </w:tcPr>
+          <w:p>
+            <w:pPr>
+              <w:jc w:val="center"/>
+            </w:pPr>
+            <w:r/>
+            <w:r>
+              <w:rPr>
+                <w:rFonts w:ascii="Times New Roman" w:hAnsi="Times New Roman"/>
+                <w:sz w:val="18"/>
+              </w:rPr>
+              <w:t>5,9</w:t>
+            </w:r>
+          </w:p>
+        </w:tc>
+        <w:tc>
+          <w:tcPr>
+            <w:tcW w:type="dxa" w:w="1843"/>
+            <w:tcBorders>
+              <w:top w:val="single" w:sz="6" w:color="000000"/>
+              <w:bottom w:val="single" w:sz="6" w:color="000000"/>
+              <w:left w:val="nil" w:sz="6" w:color="000000"/>
+              <w:right w:val="nil" w:sz="6" w:color="000000"/>
+            </w:tcBorders>
+          </w:tcPr>
+          <w:p>
+            <w:pPr>
+              <w:jc w:val="center"/>
+            </w:pPr>
+            <w:r/>
+            <w:r>
+              <w:rPr>
+                <w:rFonts w:ascii="Times New Roman" w:hAnsi="Times New Roman"/>
+                <w:sz w:val="18"/>
+              </w:rPr>
+              <w:t>7,0</w:t>
+            </w:r>
+          </w:p>
+        </w:tc>
+        <w:tc>
+          <w:tcPr>
+            <w:tcW w:type="dxa" w:w="1843"/>
+            <w:tcBorders>
+              <w:top w:val="single" w:sz="6" w:color="000000"/>
+              <w:bottom w:val="single" w:sz="6" w:color="000000"/>
+              <w:left w:val="nil" w:sz="6" w:color="000000"/>
+              <w:right w:val="nil" w:sz="6" w:color="000000"/>
+            </w:tcBorders>
+          </w:tcPr>
+          <w:p>
+            <w:pPr>
+              <w:jc w:val="center"/>
+            </w:pPr>
+            <w:r/>
+            <w:r>
+              <w:rPr>
+                <w:rFonts w:ascii="Times New Roman" w:hAnsi="Times New Roman"/>
+                <w:sz w:val="18"/>
+              </w:rPr>
+              <w:t>0,6</w:t>
+            </w:r>
+          </w:p>
+        </w:tc>
+      </w:tr>
+    </w:tbl>
+    <w:p>
+      <w:pPr>
+        <w:spacing w:after="0"/>
+      </w:pPr>
+      <w:r>
+        <w:rPr>
+          <w:i/>
+          <w:sz w:val="17"/>
+        </w:rPr>
+        <w:t>SEM = DP × √(1 − ICC); MDC = 1,65 (90%) ou 1,96 (95%) × √2 × SEM; SWC = 0,2 × DP entre atletas. Uma mudança individual só é tomada como real quando excede a MDC.</w:t>
+      </w:r>
+    </w:p>
+    <w:p>
+      <w:pPr>
+        <w:spacing w:after="120"/>
+      </w:pPr>
+      <w:r>
+        <w:rPr>
+          <w:sz w:val="18"/>
+        </w:rPr>
+        <w:t>Fonte: dados da pesquisa (2026).</w:t>
+      </w:r>
+    </w:p>
+    <w:p>
+      <w:pPr>
         <w:spacing w:before="120" w:after="80" w:line="360" w:lineRule="auto"/>
       </w:pPr>
       <w:r>
@@ -2154,7 +2593,7 @@
           <w:b w:val="0"/>
           <w:sz w:val="24"/>
         </w:rPr>
-        <w:t>Essa mudança de forma correspondeu a um deslocamento da prevalência dos perfis (Tabela 3). O perfil iceberg caiu de 48% no primeiro dia para 22% no último, enquanto a barbatana de tubarão subiu de 4% para 22% e o perfil submerso passou de 4% para 14%. A reorganização categórica não alcançou significância no teste do qui-quadrado (χ² = 8,96; p = 0,111), resultado esperado pela baixa contagem por célula quando poucas observações se distribuem por seis perfis. A regressão logística de tendência, porém, confirmou o aumento da chance do perfil de barbatana de tubarão a cada dia (OR = 1,37), sem que os perfis de maior risco à saúde mental se instalassem.</w:t>
+        <w:t>Essa mudança de forma correspondeu a um deslocamento da prevalência dos perfis (Tabela 4). O perfil iceberg caiu de 48% no primeiro dia para 22% no último, enquanto a barbatana de tubarão subiu de 4% para 22% e o perfil submerso passou de 4% para 14%. A reorganização categórica não alcançou significância no teste do qui-quadrado (χ² = 8,96; p = 0,111), resultado esperado pela baixa contagem por célula quando poucas observações se distribuem por seis perfis. A regressão logística de tendência, porém, confirmou o aumento da chance do perfil de barbatana de tubarão a cada dia (OR = 1,37), sem que os perfis de maior risco à saúde mental se instalassem.</w:t>
       </w:r>
     </w:p>
     <w:p>
@@ -2165,7 +2604,7 @@
         <w:rPr>
           <w:sz w:val="22"/>
         </w:rPr>
-        <w:t>Tabela 3 – Distribuição dos seis perfis de humor no primeiro e no último dia do microciclo: n (%).</w:t>
+        <w:t>Tabela 4 – Distribuição dos seis perfis de humor no primeiro e no último dia do microciclo: n (%).</w:t>
       </w:r>
     </w:p>
     <w:tbl>
@@ -2753,7 +3192,7 @@
           <w:b w:val="0"/>
           <w:sz w:val="24"/>
         </w:rPr>
-        <w:t>A comparação entre o primeiro e o último dia do microciclo quantificou a magnitude da mudança em cada dimensão (Tabela 4). O efeito foi grande no vigor, que caiu 49% (dz = -1,33), e na fadiga, que subiu 115% (dz = 0,78), ao passo que as demais dimensões apresentaram efeitos de menor magnitude. A análise multivariada confirmou a diferença global entre os dois dias (Wilks λ = 0,181; p &lt; 0,001), e, sob a correção de Bonferroni, apenas o vigor e a fadiga permaneceram significativos, o que concentra o efeito no eixo energia–fadiga.</w:t>
+        <w:t>A comparação entre o primeiro e o último dia do microciclo quantificou a magnitude da mudança em cada dimensão (Tabela 5). O efeito foi grande no vigor, que caiu 49% (dz = -1,33), e na fadiga, que subiu 115% (dz = 0,78), ao passo que as demais dimensões apresentaram efeitos de menor magnitude. A análise multivariada confirmou a diferença global entre os dois dias (Wilks λ = 0,181; p &lt; 0,001), e, sob a correção de Bonferroni, apenas o vigor e a fadiga permaneceram significativos, o que concentra o efeito no eixo energia–fadiga.</w:t>
       </w:r>
     </w:p>
     <w:p>
@@ -2764,7 +3203,7 @@
         <w:rPr>
           <w:sz w:val="22"/>
         </w:rPr>
-        <w:t>Tabela 4 – Diferença das dimensões do BRUMS e da PTH entre o primeiro e o último dia do microciclo (com tamanho e magnitude do efeito).</w:t>
+        <w:t>Tabela 5 – Diferença das dimensões do BRUMS e da PTH entre o primeiro e o último dia do microciclo (com tamanho e magnitude do efeito).</w:t>
       </w:r>
     </w:p>
     <w:tbl>
@@ -4202,7 +4641,7 @@
           <w:b w:val="0"/>
           <w:sz w:val="24"/>
         </w:rPr>
-        <w:t>A comparação das dimensões entre os sete dias pelo teste de Friedman (Tabela 5) apontou variação significativa no vigor (p &lt; 0,001; W = 0,21) e na fadiga (p = 0,007; W = 0,16), com magnitude pequena a moderada, além de diferenças na tensão e na confusão. O vigor foi máximo no Dia 1 e mínimo no Dia 7, enquanto a fadiga percorreu o caminho inverso, com pico no Dia 7, um padrão coerente com o acúmulo de carga dentro da faixa funcional.</w:t>
+        <w:t>A comparação das dimensões entre os sete dias pelo teste de Friedman (Tabela 6) apontou variação significativa no vigor (p &lt; 0,001; W = 0,21) e na fadiga (p = 0,007; W = 0,16), com magnitude pequena a moderada, além de diferenças na tensão e na confusão. O vigor foi máximo no Dia 1 e mínimo no Dia 7, enquanto a fadiga percorreu o caminho inverso, com pico no Dia 7, um padrão coerente com o acúmulo de carga dentro da faixa funcional.</w:t>
       </w:r>
     </w:p>
     <w:p>
@@ -4213,7 +4652,7 @@
         <w:rPr>
           <w:sz w:val="22"/>
         </w:rPr>
-        <w:t>Tabela 5 – Médias diárias das dimensões do BRUMS e teste de Friedman com W de Kendall e magnitude do efeito (comparação entre os sete dias).</w:t>
+        <w:t>Tabela 6 – Médias diárias das dimensões do BRUMS e teste de Friedman com W de Kendall e magnitude do efeito (comparação entre os sete dias).</w:t>
       </w:r>
     </w:p>
     <w:tbl>
@@ -6677,6 +7116,83 @@
     </w:p>
     <w:p>
       <w:pPr>
+        <w:spacing w:line="360" w:lineRule="auto" w:after="0"/>
+        <w:ind w:firstLine="709"/>
+        <w:jc w:val="both"/>
+      </w:pPr>
+      <w:r>
+        <w:rPr>
+          <w:b w:val="0"/>
+          <w:sz w:val="24"/>
+        </w:rPr>
+        <w:t>A Figura 5 detalha, por meio de diagramas de caixa por dia, a distribuição de cada dimensão ao longo da semana. O deslocamento das caixas do vigor para baixo e das caixas da fadiga para cima, sobretudo na segunda metade do microciclo, torna visível a mesma deterioração do eixo energia–fadiga, ao passo que as dimensões negativas de menor expressão mantêm caixas comprimidas junto ao zero.</w:t>
+      </w:r>
+    </w:p>
+    <w:p>
+      <w:pPr>
+        <w:spacing w:before="120"/>
+        <w:jc w:val="center"/>
+      </w:pPr>
+      <w:r>
+        <w:drawing>
+          <wp:inline xmlns:a="http://schemas.openxmlformats.org/drawingml/2006/main" xmlns:pic="http://schemas.openxmlformats.org/drawingml/2006/picture">
+            <wp:extent cx="5400000" cy="2630769"/>
+            <wp:docPr id="5" name="Picture 5"/>
+            <wp:cNvGraphicFramePr>
+              <a:graphicFrameLocks noChangeAspect="1"/>
+            </wp:cNvGraphicFramePr>
+            <a:graphic>
+              <a:graphicData uri="http://schemas.openxmlformats.org/drawingml/2006/picture">
+                <pic:pic>
+                  <pic:nvPicPr>
+                    <pic:cNvPr id="0" name="xb3_box.png"/>
+                    <pic:cNvPicPr/>
+                  </pic:nvPicPr>
+                  <pic:blipFill>
+                    <a:blip r:embed="rId13"/>
+                    <a:stretch>
+                      <a:fillRect/>
+                    </a:stretch>
+                  </pic:blipFill>
+                  <pic:spPr>
+                    <a:xfrm>
+                      <a:off x="0" y="0"/>
+                      <a:ext cx="5400000" cy="2630769"/>
+                    </a:xfrm>
+                    <a:prstGeom prst="rect"/>
+                  </pic:spPr>
+                </pic:pic>
+              </a:graphicData>
+            </a:graphic>
+          </wp:inline>
+        </w:drawing>
+      </w:r>
+    </w:p>
+    <w:p>
+      <w:pPr>
+        <w:jc w:val="center"/>
+      </w:pPr>
+      <w:r>
+        <w:rPr>
+          <w:sz w:val="22"/>
+        </w:rPr>
+        <w:t>Figura 5 – Diagramas de caixa das seis dimensões do BRUMS por dia do microciclo (áreas sombreadas: início e acúmulo da semana).</w:t>
+      </w:r>
+    </w:p>
+    <w:p>
+      <w:pPr>
+        <w:spacing w:after="120"/>
+        <w:jc w:val="center"/>
+      </w:pPr>
+      <w:r>
+        <w:rPr>
+          <w:sz w:val="18"/>
+        </w:rPr>
+        <w:t>Fonte: elaboração dos autores (2026).</w:t>
+      </w:r>
+    </w:p>
+    <w:p>
+      <w:pPr>
         <w:spacing w:before="120" w:after="80" w:line="360" w:lineRule="auto"/>
       </w:pPr>
       <w:r>
@@ -6684,7 +7200,7 @@
           <w:b/>
           <w:sz w:val="24"/>
         </w:rPr>
-        <w:t>4.5 Variação entre pré e pós-treino (Wilcoxon)</w:t>
+        <w:t>4.5 Dias de pico e comparação de cada dia ao primeiro</w:t>
       </w:r>
     </w:p>
     <w:p>
@@ -6698,7 +7214,7 @@
           <w:b w:val="0"/>
           <w:sz w:val="24"/>
         </w:rPr>
-        <w:t>A comparação entre pré e pós-treino pelo teste de Wilcoxon (Tabela 6) evidenciou uma resposta aguda coerente com o esforço: o vigor caiu (d = -0,47) e a fadiga e a PTH subiram do momento pré para o pós, com efeito de magnitude pequena a moderada. Essa oscilação dentro do dia somou-se à tendência semanal e ajudou a compor o quadro de fadiga funcional observado no fim do microciclo.</w:t>
+        <w:t>A localização dos picos sintetiza a dinâmica semanal (Tabela 7). O vigor foi máximo no Dia 1 e mínimo no Dia 7; a fadiga foi máxima no Dia 7; a tensão, no Dia 1; a raiva, no Dia 7; e a depressão, no Dia 7. Em síntese, o início da semana reúne maior prontidão, com vigor e tensão mais altos, ao passo que o final concentra a fadiga e a raiva.</w:t>
       </w:r>
     </w:p>
     <w:p>
@@ -6709,7 +7225,1658 @@
         <w:rPr>
           <w:sz w:val="22"/>
         </w:rPr>
-        <w:t>Tabela 6 – Comparação entre pré e pós-treino das dimensões do BRUMS e da PTH (teste de Wilcoxon e d de Cohen).</w:t>
+        <w:t>Tabela 7 – Dia de maior e de menor expressão de cada dimensão do humor (médias diárias).</w:t>
+      </w:r>
+    </w:p>
+    <w:tbl>
+      <w:tblPr>
+        <w:tblW w:type="auto" w:w="0"/>
+        <w:jc w:val="center"/>
+        <w:tblLayout w:type="fixed"/>
+        <w:tblLook w:firstColumn="1" w:firstRow="1" w:lastColumn="0" w:lastRow="0" w:noHBand="0" w:noVBand="1" w:val="04A0"/>
+        <w:tblLayout w:type="fixed"/>
+        <w:tblCellMar>
+          <w:left w:w="40" w:type="dxa"/>
+          <w:right w:w="40" w:type="dxa"/>
+        </w:tblCellMar>
+      </w:tblPr>
+      <w:tblGrid>
+        <w:gridCol w:w="1701"/>
+        <w:gridCol w:w="1842"/>
+        <w:gridCol w:w="1842"/>
+        <w:gridCol w:w="1842"/>
+        <w:gridCol w:w="1842"/>
+      </w:tblGrid>
+      <w:tr>
+        <w:tc>
+          <w:tcPr>
+            <w:tcW w:type="dxa" w:w="1701"/>
+            <w:tcBorders>
+              <w:top w:val="single" w:sz="6" w:color="000000"/>
+              <w:bottom w:val="single" w:sz="6" w:color="000000"/>
+              <w:left w:val="nil" w:sz="6" w:color="000000"/>
+              <w:right w:val="nil" w:sz="6" w:color="000000"/>
+            </w:tcBorders>
+          </w:tcPr>
+          <w:p>
+            <w:pPr>
+              <w:jc w:val="center"/>
+            </w:pPr>
+            <w:r/>
+            <w:r>
+              <w:rPr>
+                <w:rFonts w:ascii="Times New Roman" w:hAnsi="Times New Roman"/>
+                <w:b/>
+                <w:sz w:val="18"/>
+              </w:rPr>
+              <w:t>Dimensão</w:t>
+            </w:r>
+          </w:p>
+        </w:tc>
+        <w:tc>
+          <w:tcPr>
+            <w:tcW w:type="dxa" w:w="1843"/>
+            <w:tcBorders>
+              <w:top w:val="single" w:sz="6" w:color="000000"/>
+              <w:bottom w:val="single" w:sz="6" w:color="000000"/>
+              <w:left w:val="nil" w:sz="6" w:color="000000"/>
+              <w:right w:val="nil" w:sz="6" w:color="000000"/>
+            </w:tcBorders>
+          </w:tcPr>
+          <w:p>
+            <w:pPr>
+              <w:jc w:val="center"/>
+            </w:pPr>
+            <w:r/>
+            <w:r>
+              <w:rPr>
+                <w:rFonts w:ascii="Times New Roman" w:hAnsi="Times New Roman"/>
+                <w:b/>
+                <w:sz w:val="18"/>
+              </w:rPr>
+              <w:t>Dia de maior valor</w:t>
+            </w:r>
+          </w:p>
+        </w:tc>
+        <w:tc>
+          <w:tcPr>
+            <w:tcW w:type="dxa" w:w="1843"/>
+            <w:tcBorders>
+              <w:top w:val="single" w:sz="6" w:color="000000"/>
+              <w:bottom w:val="single" w:sz="6" w:color="000000"/>
+              <w:left w:val="nil" w:sz="6" w:color="000000"/>
+              <w:right w:val="nil" w:sz="6" w:color="000000"/>
+            </w:tcBorders>
+          </w:tcPr>
+          <w:p>
+            <w:pPr>
+              <w:jc w:val="center"/>
+            </w:pPr>
+            <w:r/>
+            <w:r>
+              <w:rPr>
+                <w:rFonts w:ascii="Times New Roman" w:hAnsi="Times New Roman"/>
+                <w:b/>
+                <w:sz w:val="18"/>
+              </w:rPr>
+              <w:t>Valor</w:t>
+            </w:r>
+          </w:p>
+        </w:tc>
+        <w:tc>
+          <w:tcPr>
+            <w:tcW w:type="dxa" w:w="1843"/>
+            <w:tcBorders>
+              <w:top w:val="single" w:sz="6" w:color="000000"/>
+              <w:bottom w:val="single" w:sz="6" w:color="000000"/>
+              <w:left w:val="nil" w:sz="6" w:color="000000"/>
+              <w:right w:val="nil" w:sz="6" w:color="000000"/>
+            </w:tcBorders>
+          </w:tcPr>
+          <w:p>
+            <w:pPr>
+              <w:jc w:val="center"/>
+            </w:pPr>
+            <w:r/>
+            <w:r>
+              <w:rPr>
+                <w:rFonts w:ascii="Times New Roman" w:hAnsi="Times New Roman"/>
+                <w:b/>
+                <w:sz w:val="18"/>
+              </w:rPr>
+              <w:t>Dia de menor valor</w:t>
+            </w:r>
+          </w:p>
+        </w:tc>
+        <w:tc>
+          <w:tcPr>
+            <w:tcW w:type="dxa" w:w="1843"/>
+            <w:tcBorders>
+              <w:top w:val="single" w:sz="6" w:color="000000"/>
+              <w:bottom w:val="single" w:sz="6" w:color="000000"/>
+              <w:left w:val="nil" w:sz="6" w:color="000000"/>
+              <w:right w:val="nil" w:sz="6" w:color="000000"/>
+            </w:tcBorders>
+          </w:tcPr>
+          <w:p>
+            <w:pPr>
+              <w:jc w:val="center"/>
+            </w:pPr>
+            <w:r/>
+            <w:r>
+              <w:rPr>
+                <w:rFonts w:ascii="Times New Roman" w:hAnsi="Times New Roman"/>
+                <w:b/>
+                <w:sz w:val="18"/>
+              </w:rPr>
+              <w:t>Valor</w:t>
+            </w:r>
+          </w:p>
+        </w:tc>
+      </w:tr>
+      <w:tr>
+        <w:tc>
+          <w:tcPr>
+            <w:tcW w:type="dxa" w:w="1701"/>
+            <w:tcBorders>
+              <w:top w:val="single" w:sz="6" w:color="000000"/>
+              <w:bottom w:val="single" w:sz="6" w:color="000000"/>
+              <w:left w:val="nil" w:sz="6" w:color="000000"/>
+              <w:right w:val="nil" w:sz="6" w:color="000000"/>
+            </w:tcBorders>
+          </w:tcPr>
+          <w:p>
+            <w:pPr>
+              <w:jc w:val="left"/>
+            </w:pPr>
+            <w:r/>
+            <w:r>
+              <w:rPr>
+                <w:rFonts w:ascii="Times New Roman" w:hAnsi="Times New Roman"/>
+                <w:sz w:val="18"/>
+              </w:rPr>
+              <w:t>Tensão</w:t>
+            </w:r>
+          </w:p>
+        </w:tc>
+        <w:tc>
+          <w:tcPr>
+            <w:tcW w:type="dxa" w:w="1843"/>
+            <w:tcBorders>
+              <w:top w:val="single" w:sz="6" w:color="000000"/>
+              <w:bottom w:val="single" w:sz="6" w:color="000000"/>
+              <w:left w:val="nil" w:sz="6" w:color="000000"/>
+              <w:right w:val="nil" w:sz="6" w:color="000000"/>
+            </w:tcBorders>
+          </w:tcPr>
+          <w:p>
+            <w:pPr>
+              <w:jc w:val="center"/>
+            </w:pPr>
+            <w:r/>
+            <w:r>
+              <w:rPr>
+                <w:rFonts w:ascii="Times New Roman" w:hAnsi="Times New Roman"/>
+                <w:sz w:val="18"/>
+              </w:rPr>
+              <w:t>Dia 1</w:t>
+            </w:r>
+          </w:p>
+        </w:tc>
+        <w:tc>
+          <w:tcPr>
+            <w:tcW w:type="dxa" w:w="1843"/>
+            <w:tcBorders>
+              <w:top w:val="single" w:sz="6" w:color="000000"/>
+              <w:bottom w:val="single" w:sz="6" w:color="000000"/>
+              <w:left w:val="nil" w:sz="6" w:color="000000"/>
+              <w:right w:val="nil" w:sz="6" w:color="000000"/>
+            </w:tcBorders>
+          </w:tcPr>
+          <w:p>
+            <w:pPr>
+              <w:jc w:val="center"/>
+            </w:pPr>
+            <w:r/>
+            <w:r>
+              <w:rPr>
+                <w:rFonts w:ascii="Times New Roman" w:hAnsi="Times New Roman"/>
+                <w:sz w:val="18"/>
+              </w:rPr>
+              <w:t>2,15</w:t>
+            </w:r>
+          </w:p>
+        </w:tc>
+        <w:tc>
+          <w:tcPr>
+            <w:tcW w:type="dxa" w:w="1843"/>
+            <w:tcBorders>
+              <w:top w:val="single" w:sz="6" w:color="000000"/>
+              <w:bottom w:val="single" w:sz="6" w:color="000000"/>
+              <w:left w:val="nil" w:sz="6" w:color="000000"/>
+              <w:right w:val="nil" w:sz="6" w:color="000000"/>
+            </w:tcBorders>
+          </w:tcPr>
+          <w:p>
+            <w:pPr>
+              <w:jc w:val="center"/>
+            </w:pPr>
+            <w:r/>
+            <w:r>
+              <w:rPr>
+                <w:rFonts w:ascii="Times New Roman" w:hAnsi="Times New Roman"/>
+                <w:sz w:val="18"/>
+              </w:rPr>
+              <w:t>Dia 7</w:t>
+            </w:r>
+          </w:p>
+        </w:tc>
+        <w:tc>
+          <w:tcPr>
+            <w:tcW w:type="dxa" w:w="1843"/>
+            <w:tcBorders>
+              <w:top w:val="single" w:sz="6" w:color="000000"/>
+              <w:bottom w:val="single" w:sz="6" w:color="000000"/>
+              <w:left w:val="nil" w:sz="6" w:color="000000"/>
+              <w:right w:val="nil" w:sz="6" w:color="000000"/>
+            </w:tcBorders>
+          </w:tcPr>
+          <w:p>
+            <w:pPr>
+              <w:jc w:val="center"/>
+            </w:pPr>
+            <w:r/>
+            <w:r>
+              <w:rPr>
+                <w:rFonts w:ascii="Times New Roman" w:hAnsi="Times New Roman"/>
+                <w:sz w:val="18"/>
+              </w:rPr>
+              <w:t>1,05</w:t>
+            </w:r>
+          </w:p>
+        </w:tc>
+      </w:tr>
+      <w:tr>
+        <w:tc>
+          <w:tcPr>
+            <w:tcW w:type="dxa" w:w="1701"/>
+            <w:tcBorders>
+              <w:top w:val="single" w:sz="6" w:color="000000"/>
+              <w:bottom w:val="single" w:sz="6" w:color="000000"/>
+              <w:left w:val="nil" w:sz="6" w:color="000000"/>
+              <w:right w:val="nil" w:sz="6" w:color="000000"/>
+            </w:tcBorders>
+          </w:tcPr>
+          <w:p>
+            <w:pPr>
+              <w:jc w:val="left"/>
+            </w:pPr>
+            <w:r/>
+            <w:r>
+              <w:rPr>
+                <w:rFonts w:ascii="Times New Roman" w:hAnsi="Times New Roman"/>
+                <w:sz w:val="18"/>
+              </w:rPr>
+              <w:t>Depressão</w:t>
+            </w:r>
+          </w:p>
+        </w:tc>
+        <w:tc>
+          <w:tcPr>
+            <w:tcW w:type="dxa" w:w="1843"/>
+            <w:tcBorders>
+              <w:top w:val="single" w:sz="6" w:color="000000"/>
+              <w:bottom w:val="single" w:sz="6" w:color="000000"/>
+              <w:left w:val="nil" w:sz="6" w:color="000000"/>
+              <w:right w:val="nil" w:sz="6" w:color="000000"/>
+            </w:tcBorders>
+          </w:tcPr>
+          <w:p>
+            <w:pPr>
+              <w:jc w:val="center"/>
+            </w:pPr>
+            <w:r/>
+            <w:r>
+              <w:rPr>
+                <w:rFonts w:ascii="Times New Roman" w:hAnsi="Times New Roman"/>
+                <w:sz w:val="18"/>
+              </w:rPr>
+              <w:t>Dia 7</w:t>
+            </w:r>
+          </w:p>
+        </w:tc>
+        <w:tc>
+          <w:tcPr>
+            <w:tcW w:type="dxa" w:w="1843"/>
+            <w:tcBorders>
+              <w:top w:val="single" w:sz="6" w:color="000000"/>
+              <w:bottom w:val="single" w:sz="6" w:color="000000"/>
+              <w:left w:val="nil" w:sz="6" w:color="000000"/>
+              <w:right w:val="nil" w:sz="6" w:color="000000"/>
+            </w:tcBorders>
+          </w:tcPr>
+          <w:p>
+            <w:pPr>
+              <w:jc w:val="center"/>
+            </w:pPr>
+            <w:r/>
+            <w:r>
+              <w:rPr>
+                <w:rFonts w:ascii="Times New Roman" w:hAnsi="Times New Roman"/>
+                <w:sz w:val="18"/>
+              </w:rPr>
+              <w:t>1,35</w:t>
+            </w:r>
+          </w:p>
+        </w:tc>
+        <w:tc>
+          <w:tcPr>
+            <w:tcW w:type="dxa" w:w="1843"/>
+            <w:tcBorders>
+              <w:top w:val="single" w:sz="6" w:color="000000"/>
+              <w:bottom w:val="single" w:sz="6" w:color="000000"/>
+              <w:left w:val="nil" w:sz="6" w:color="000000"/>
+              <w:right w:val="nil" w:sz="6" w:color="000000"/>
+            </w:tcBorders>
+          </w:tcPr>
+          <w:p>
+            <w:pPr>
+              <w:jc w:val="center"/>
+            </w:pPr>
+            <w:r/>
+            <w:r>
+              <w:rPr>
+                <w:rFonts w:ascii="Times New Roman" w:hAnsi="Times New Roman"/>
+                <w:sz w:val="18"/>
+              </w:rPr>
+              <w:t>Dia 1</w:t>
+            </w:r>
+          </w:p>
+        </w:tc>
+        <w:tc>
+          <w:tcPr>
+            <w:tcW w:type="dxa" w:w="1843"/>
+            <w:tcBorders>
+              <w:top w:val="single" w:sz="6" w:color="000000"/>
+              <w:bottom w:val="single" w:sz="6" w:color="000000"/>
+              <w:left w:val="nil" w:sz="6" w:color="000000"/>
+              <w:right w:val="nil" w:sz="6" w:color="000000"/>
+            </w:tcBorders>
+          </w:tcPr>
+          <w:p>
+            <w:pPr>
+              <w:jc w:val="center"/>
+            </w:pPr>
+            <w:r/>
+            <w:r>
+              <w:rPr>
+                <w:rFonts w:ascii="Times New Roman" w:hAnsi="Times New Roman"/>
+                <w:sz w:val="18"/>
+              </w:rPr>
+              <w:t>0,59</w:t>
+            </w:r>
+          </w:p>
+        </w:tc>
+      </w:tr>
+      <w:tr>
+        <w:tc>
+          <w:tcPr>
+            <w:tcW w:type="dxa" w:w="1701"/>
+            <w:tcBorders>
+              <w:top w:val="single" w:sz="6" w:color="000000"/>
+              <w:bottom w:val="single" w:sz="6" w:color="000000"/>
+              <w:left w:val="nil" w:sz="6" w:color="000000"/>
+              <w:right w:val="nil" w:sz="6" w:color="000000"/>
+            </w:tcBorders>
+          </w:tcPr>
+          <w:p>
+            <w:pPr>
+              <w:jc w:val="left"/>
+            </w:pPr>
+            <w:r/>
+            <w:r>
+              <w:rPr>
+                <w:rFonts w:ascii="Times New Roman" w:hAnsi="Times New Roman"/>
+                <w:sz w:val="18"/>
+              </w:rPr>
+              <w:t>Raiva</w:t>
+            </w:r>
+          </w:p>
+        </w:tc>
+        <w:tc>
+          <w:tcPr>
+            <w:tcW w:type="dxa" w:w="1843"/>
+            <w:tcBorders>
+              <w:top w:val="single" w:sz="6" w:color="000000"/>
+              <w:bottom w:val="single" w:sz="6" w:color="000000"/>
+              <w:left w:val="nil" w:sz="6" w:color="000000"/>
+              <w:right w:val="nil" w:sz="6" w:color="000000"/>
+            </w:tcBorders>
+          </w:tcPr>
+          <w:p>
+            <w:pPr>
+              <w:jc w:val="center"/>
+            </w:pPr>
+            <w:r/>
+            <w:r>
+              <w:rPr>
+                <w:rFonts w:ascii="Times New Roman" w:hAnsi="Times New Roman"/>
+                <w:sz w:val="18"/>
+              </w:rPr>
+              <w:t>Dia 7</w:t>
+            </w:r>
+          </w:p>
+        </w:tc>
+        <w:tc>
+          <w:tcPr>
+            <w:tcW w:type="dxa" w:w="1843"/>
+            <w:tcBorders>
+              <w:top w:val="single" w:sz="6" w:color="000000"/>
+              <w:bottom w:val="single" w:sz="6" w:color="000000"/>
+              <w:left w:val="nil" w:sz="6" w:color="000000"/>
+              <w:right w:val="nil" w:sz="6" w:color="000000"/>
+            </w:tcBorders>
+          </w:tcPr>
+          <w:p>
+            <w:pPr>
+              <w:jc w:val="center"/>
+            </w:pPr>
+            <w:r/>
+            <w:r>
+              <w:rPr>
+                <w:rFonts w:ascii="Times New Roman" w:hAnsi="Times New Roman"/>
+                <w:sz w:val="18"/>
+              </w:rPr>
+              <w:t>2,54</w:t>
+            </w:r>
+          </w:p>
+        </w:tc>
+        <w:tc>
+          <w:tcPr>
+            <w:tcW w:type="dxa" w:w="1843"/>
+            <w:tcBorders>
+              <w:top w:val="single" w:sz="6" w:color="000000"/>
+              <w:bottom w:val="single" w:sz="6" w:color="000000"/>
+              <w:left w:val="nil" w:sz="6" w:color="000000"/>
+              <w:right w:val="nil" w:sz="6" w:color="000000"/>
+            </w:tcBorders>
+          </w:tcPr>
+          <w:p>
+            <w:pPr>
+              <w:jc w:val="center"/>
+            </w:pPr>
+            <w:r/>
+            <w:r>
+              <w:rPr>
+                <w:rFonts w:ascii="Times New Roman" w:hAnsi="Times New Roman"/>
+                <w:sz w:val="18"/>
+              </w:rPr>
+              <w:t>Dia 5</w:t>
+            </w:r>
+          </w:p>
+        </w:tc>
+        <w:tc>
+          <w:tcPr>
+            <w:tcW w:type="dxa" w:w="1843"/>
+            <w:tcBorders>
+              <w:top w:val="single" w:sz="6" w:color="000000"/>
+              <w:bottom w:val="single" w:sz="6" w:color="000000"/>
+              <w:left w:val="nil" w:sz="6" w:color="000000"/>
+              <w:right w:val="nil" w:sz="6" w:color="000000"/>
+            </w:tcBorders>
+          </w:tcPr>
+          <w:p>
+            <w:pPr>
+              <w:jc w:val="center"/>
+            </w:pPr>
+            <w:r/>
+            <w:r>
+              <w:rPr>
+                <w:rFonts w:ascii="Times New Roman" w:hAnsi="Times New Roman"/>
+                <w:sz w:val="18"/>
+              </w:rPr>
+              <w:t>0,57</w:t>
+            </w:r>
+          </w:p>
+        </w:tc>
+      </w:tr>
+      <w:tr>
+        <w:tc>
+          <w:tcPr>
+            <w:tcW w:type="dxa" w:w="1701"/>
+            <w:tcBorders>
+              <w:top w:val="single" w:sz="6" w:color="000000"/>
+              <w:bottom w:val="single" w:sz="6" w:color="000000"/>
+              <w:left w:val="nil" w:sz="6" w:color="000000"/>
+              <w:right w:val="nil" w:sz="6" w:color="000000"/>
+            </w:tcBorders>
+          </w:tcPr>
+          <w:p>
+            <w:pPr>
+              <w:jc w:val="left"/>
+            </w:pPr>
+            <w:r/>
+            <w:r>
+              <w:rPr>
+                <w:rFonts w:ascii="Times New Roman" w:hAnsi="Times New Roman"/>
+                <w:sz w:val="18"/>
+              </w:rPr>
+              <w:t>Vigor</w:t>
+            </w:r>
+          </w:p>
+        </w:tc>
+        <w:tc>
+          <w:tcPr>
+            <w:tcW w:type="dxa" w:w="1843"/>
+            <w:tcBorders>
+              <w:top w:val="single" w:sz="6" w:color="000000"/>
+              <w:bottom w:val="single" w:sz="6" w:color="000000"/>
+              <w:left w:val="nil" w:sz="6" w:color="000000"/>
+              <w:right w:val="nil" w:sz="6" w:color="000000"/>
+            </w:tcBorders>
+          </w:tcPr>
+          <w:p>
+            <w:pPr>
+              <w:jc w:val="center"/>
+            </w:pPr>
+            <w:r/>
+            <w:r>
+              <w:rPr>
+                <w:rFonts w:ascii="Times New Roman" w:hAnsi="Times New Roman"/>
+                <w:sz w:val="18"/>
+              </w:rPr>
+              <w:t>Dia 1</w:t>
+            </w:r>
+          </w:p>
+        </w:tc>
+        <w:tc>
+          <w:tcPr>
+            <w:tcW w:type="dxa" w:w="1843"/>
+            <w:tcBorders>
+              <w:top w:val="single" w:sz="6" w:color="000000"/>
+              <w:bottom w:val="single" w:sz="6" w:color="000000"/>
+              <w:left w:val="nil" w:sz="6" w:color="000000"/>
+              <w:right w:val="nil" w:sz="6" w:color="000000"/>
+            </w:tcBorders>
+          </w:tcPr>
+          <w:p>
+            <w:pPr>
+              <w:jc w:val="center"/>
+            </w:pPr>
+            <w:r/>
+            <w:r>
+              <w:rPr>
+                <w:rFonts w:ascii="Times New Roman" w:hAnsi="Times New Roman"/>
+                <w:sz w:val="18"/>
+              </w:rPr>
+              <w:t>8,30</w:t>
+            </w:r>
+          </w:p>
+        </w:tc>
+        <w:tc>
+          <w:tcPr>
+            <w:tcW w:type="dxa" w:w="1843"/>
+            <w:tcBorders>
+              <w:top w:val="single" w:sz="6" w:color="000000"/>
+              <w:bottom w:val="single" w:sz="6" w:color="000000"/>
+              <w:left w:val="nil" w:sz="6" w:color="000000"/>
+              <w:right w:val="nil" w:sz="6" w:color="000000"/>
+            </w:tcBorders>
+          </w:tcPr>
+          <w:p>
+            <w:pPr>
+              <w:jc w:val="center"/>
+            </w:pPr>
+            <w:r/>
+            <w:r>
+              <w:rPr>
+                <w:rFonts w:ascii="Times New Roman" w:hAnsi="Times New Roman"/>
+                <w:sz w:val="18"/>
+              </w:rPr>
+              <w:t>Dia 7</w:t>
+            </w:r>
+          </w:p>
+        </w:tc>
+        <w:tc>
+          <w:tcPr>
+            <w:tcW w:type="dxa" w:w="1843"/>
+            <w:tcBorders>
+              <w:top w:val="single" w:sz="6" w:color="000000"/>
+              <w:bottom w:val="single" w:sz="6" w:color="000000"/>
+              <w:left w:val="nil" w:sz="6" w:color="000000"/>
+              <w:right w:val="nil" w:sz="6" w:color="000000"/>
+            </w:tcBorders>
+          </w:tcPr>
+          <w:p>
+            <w:pPr>
+              <w:jc w:val="center"/>
+            </w:pPr>
+            <w:r/>
+            <w:r>
+              <w:rPr>
+                <w:rFonts w:ascii="Times New Roman" w:hAnsi="Times New Roman"/>
+                <w:sz w:val="18"/>
+              </w:rPr>
+              <w:t>4,43</w:t>
+            </w:r>
+          </w:p>
+        </w:tc>
+      </w:tr>
+      <w:tr>
+        <w:tc>
+          <w:tcPr>
+            <w:tcW w:type="dxa" w:w="1701"/>
+            <w:tcBorders>
+              <w:top w:val="single" w:sz="6" w:color="000000"/>
+              <w:bottom w:val="single" w:sz="6" w:color="000000"/>
+              <w:left w:val="nil" w:sz="6" w:color="000000"/>
+              <w:right w:val="nil" w:sz="6" w:color="000000"/>
+            </w:tcBorders>
+          </w:tcPr>
+          <w:p>
+            <w:pPr>
+              <w:jc w:val="left"/>
+            </w:pPr>
+            <w:r/>
+            <w:r>
+              <w:rPr>
+                <w:rFonts w:ascii="Times New Roman" w:hAnsi="Times New Roman"/>
+                <w:sz w:val="18"/>
+              </w:rPr>
+              <w:t>Fadiga</w:t>
+            </w:r>
+          </w:p>
+        </w:tc>
+        <w:tc>
+          <w:tcPr>
+            <w:tcW w:type="dxa" w:w="1843"/>
+            <w:tcBorders>
+              <w:top w:val="single" w:sz="6" w:color="000000"/>
+              <w:bottom w:val="single" w:sz="6" w:color="000000"/>
+              <w:left w:val="nil" w:sz="6" w:color="000000"/>
+              <w:right w:val="nil" w:sz="6" w:color="000000"/>
+            </w:tcBorders>
+          </w:tcPr>
+          <w:p>
+            <w:pPr>
+              <w:jc w:val="center"/>
+            </w:pPr>
+            <w:r/>
+            <w:r>
+              <w:rPr>
+                <w:rFonts w:ascii="Times New Roman" w:hAnsi="Times New Roman"/>
+                <w:sz w:val="18"/>
+              </w:rPr>
+              <w:t>Dia 7</w:t>
+            </w:r>
+          </w:p>
+        </w:tc>
+        <w:tc>
+          <w:tcPr>
+            <w:tcW w:type="dxa" w:w="1843"/>
+            <w:tcBorders>
+              <w:top w:val="single" w:sz="6" w:color="000000"/>
+              <w:bottom w:val="single" w:sz="6" w:color="000000"/>
+              <w:left w:val="nil" w:sz="6" w:color="000000"/>
+              <w:right w:val="nil" w:sz="6" w:color="000000"/>
+            </w:tcBorders>
+          </w:tcPr>
+          <w:p>
+            <w:pPr>
+              <w:jc w:val="center"/>
+            </w:pPr>
+            <w:r/>
+            <w:r>
+              <w:rPr>
+                <w:rFonts w:ascii="Times New Roman" w:hAnsi="Times New Roman"/>
+                <w:sz w:val="18"/>
+              </w:rPr>
+              <w:t>7,22</w:t>
+            </w:r>
+          </w:p>
+        </w:tc>
+        <w:tc>
+          <w:tcPr>
+            <w:tcW w:type="dxa" w:w="1843"/>
+            <w:tcBorders>
+              <w:top w:val="single" w:sz="6" w:color="000000"/>
+              <w:bottom w:val="single" w:sz="6" w:color="000000"/>
+              <w:left w:val="nil" w:sz="6" w:color="000000"/>
+              <w:right w:val="nil" w:sz="6" w:color="000000"/>
+            </w:tcBorders>
+          </w:tcPr>
+          <w:p>
+            <w:pPr>
+              <w:jc w:val="center"/>
+            </w:pPr>
+            <w:r/>
+            <w:r>
+              <w:rPr>
+                <w:rFonts w:ascii="Times New Roman" w:hAnsi="Times New Roman"/>
+                <w:sz w:val="18"/>
+              </w:rPr>
+              <w:t>Dia 1</w:t>
+            </w:r>
+          </w:p>
+        </w:tc>
+        <w:tc>
+          <w:tcPr>
+            <w:tcW w:type="dxa" w:w="1843"/>
+            <w:tcBorders>
+              <w:top w:val="single" w:sz="6" w:color="000000"/>
+              <w:bottom w:val="single" w:sz="6" w:color="000000"/>
+              <w:left w:val="nil" w:sz="6" w:color="000000"/>
+              <w:right w:val="nil" w:sz="6" w:color="000000"/>
+            </w:tcBorders>
+          </w:tcPr>
+          <w:p>
+            <w:pPr>
+              <w:jc w:val="center"/>
+            </w:pPr>
+            <w:r/>
+            <w:r>
+              <w:rPr>
+                <w:rFonts w:ascii="Times New Roman" w:hAnsi="Times New Roman"/>
+                <w:sz w:val="18"/>
+              </w:rPr>
+              <w:t>3,37</w:t>
+            </w:r>
+          </w:p>
+        </w:tc>
+      </w:tr>
+      <w:tr>
+        <w:tc>
+          <w:tcPr>
+            <w:tcW w:type="dxa" w:w="1701"/>
+            <w:tcBorders>
+              <w:top w:val="single" w:sz="6" w:color="000000"/>
+              <w:bottom w:val="single" w:sz="6" w:color="000000"/>
+              <w:left w:val="nil" w:sz="6" w:color="000000"/>
+              <w:right w:val="nil" w:sz="6" w:color="000000"/>
+            </w:tcBorders>
+          </w:tcPr>
+          <w:p>
+            <w:pPr>
+              <w:jc w:val="left"/>
+            </w:pPr>
+            <w:r/>
+            <w:r>
+              <w:rPr>
+                <w:rFonts w:ascii="Times New Roman" w:hAnsi="Times New Roman"/>
+                <w:sz w:val="18"/>
+              </w:rPr>
+              <w:t>Confusão</w:t>
+            </w:r>
+          </w:p>
+        </w:tc>
+        <w:tc>
+          <w:tcPr>
+            <w:tcW w:type="dxa" w:w="1843"/>
+            <w:tcBorders>
+              <w:top w:val="single" w:sz="6" w:color="000000"/>
+              <w:bottom w:val="single" w:sz="6" w:color="000000"/>
+              <w:left w:val="nil" w:sz="6" w:color="000000"/>
+              <w:right w:val="nil" w:sz="6" w:color="000000"/>
+            </w:tcBorders>
+          </w:tcPr>
+          <w:p>
+            <w:pPr>
+              <w:jc w:val="center"/>
+            </w:pPr>
+            <w:r/>
+            <w:r>
+              <w:rPr>
+                <w:rFonts w:ascii="Times New Roman" w:hAnsi="Times New Roman"/>
+                <w:sz w:val="18"/>
+              </w:rPr>
+              <w:t>Dia 1</w:t>
+            </w:r>
+          </w:p>
+        </w:tc>
+        <w:tc>
+          <w:tcPr>
+            <w:tcW w:type="dxa" w:w="1843"/>
+            <w:tcBorders>
+              <w:top w:val="single" w:sz="6" w:color="000000"/>
+              <w:bottom w:val="single" w:sz="6" w:color="000000"/>
+              <w:left w:val="nil" w:sz="6" w:color="000000"/>
+              <w:right w:val="nil" w:sz="6" w:color="000000"/>
+            </w:tcBorders>
+          </w:tcPr>
+          <w:p>
+            <w:pPr>
+              <w:jc w:val="center"/>
+            </w:pPr>
+            <w:r/>
+            <w:r>
+              <w:rPr>
+                <w:rFonts w:ascii="Times New Roman" w:hAnsi="Times New Roman"/>
+                <w:sz w:val="18"/>
+              </w:rPr>
+              <w:t>1,04</w:t>
+            </w:r>
+          </w:p>
+        </w:tc>
+        <w:tc>
+          <w:tcPr>
+            <w:tcW w:type="dxa" w:w="1843"/>
+            <w:tcBorders>
+              <w:top w:val="single" w:sz="6" w:color="000000"/>
+              <w:bottom w:val="single" w:sz="6" w:color="000000"/>
+              <w:left w:val="nil" w:sz="6" w:color="000000"/>
+              <w:right w:val="nil" w:sz="6" w:color="000000"/>
+            </w:tcBorders>
+          </w:tcPr>
+          <w:p>
+            <w:pPr>
+              <w:jc w:val="center"/>
+            </w:pPr>
+            <w:r/>
+            <w:r>
+              <w:rPr>
+                <w:rFonts w:ascii="Times New Roman" w:hAnsi="Times New Roman"/>
+                <w:sz w:val="18"/>
+              </w:rPr>
+              <w:t>Dia 5</w:t>
+            </w:r>
+          </w:p>
+        </w:tc>
+        <w:tc>
+          <w:tcPr>
+            <w:tcW w:type="dxa" w:w="1843"/>
+            <w:tcBorders>
+              <w:top w:val="single" w:sz="6" w:color="000000"/>
+              <w:bottom w:val="single" w:sz="6" w:color="000000"/>
+              <w:left w:val="nil" w:sz="6" w:color="000000"/>
+              <w:right w:val="nil" w:sz="6" w:color="000000"/>
+            </w:tcBorders>
+          </w:tcPr>
+          <w:p>
+            <w:pPr>
+              <w:jc w:val="center"/>
+            </w:pPr>
+            <w:r/>
+            <w:r>
+              <w:rPr>
+                <w:rFonts w:ascii="Times New Roman" w:hAnsi="Times New Roman"/>
+                <w:sz w:val="18"/>
+              </w:rPr>
+              <w:t>0,21</w:t>
+            </w:r>
+          </w:p>
+        </w:tc>
+      </w:tr>
+    </w:tbl>
+    <w:p>
+      <w:pPr>
+        <w:spacing w:after="120"/>
+      </w:pPr>
+      <w:r>
+        <w:rPr>
+          <w:sz w:val="18"/>
+        </w:rPr>
+        <w:t>Fonte: dados da pesquisa (2026).</w:t>
+      </w:r>
+    </w:p>
+    <w:p>
+      <w:pPr>
+        <w:spacing w:line="360" w:lineRule="auto" w:after="0"/>
+        <w:ind w:firstLine="709"/>
+        <w:jc w:val="both"/>
+      </w:pPr>
+      <w:r>
+        <w:rPr>
+          <w:b w:val="0"/>
+          <w:sz w:val="24"/>
+        </w:rPr>
+        <w:t>No pós-teste que compara todos os dias entre si (Tabela 8; Figura 6), o vigor diferiu de forma significativa em 9 dos 21 pares de dias e a fadiga em 6, sempre no sentido de piora em relação aos primeiros dias, o que confirma a deterioração progressiva do eixo energia–fadiga ao longo do microciclo.</w:t>
+      </w:r>
+    </w:p>
+    <w:p>
+      <w:pPr>
+        <w:spacing w:before="160" w:after="40"/>
+      </w:pPr>
+      <w:r>
+        <w:rPr>
+          <w:sz w:val="22"/>
+        </w:rPr>
+        <w:t>Tabela 8 – Médias marginais estimadas por dia do vigor e da fadiga, com comparação de cada dia ao Dia 1 (pós-teste de Tukey).</w:t>
+      </w:r>
+    </w:p>
+    <w:tbl>
+      <w:tblPr>
+        <w:tblW w:type="auto" w:w="0"/>
+        <w:jc w:val="center"/>
+        <w:tblLayout w:type="fixed"/>
+        <w:tblLook w:firstColumn="1" w:firstRow="1" w:lastColumn="0" w:lastRow="0" w:noHBand="0" w:noVBand="1" w:val="04A0"/>
+        <w:tblLayout w:type="fixed"/>
+        <w:tblCellMar>
+          <w:left w:w="40" w:type="dxa"/>
+          <w:right w:w="40" w:type="dxa"/>
+        </w:tblCellMar>
+      </w:tblPr>
+      <w:tblGrid>
+        <w:gridCol w:w="1701"/>
+        <w:gridCol w:w="3685"/>
+        <w:gridCol w:w="3685"/>
+      </w:tblGrid>
+      <w:tr>
+        <w:tc>
+          <w:tcPr>
+            <w:tcW w:type="dxa" w:w="1701"/>
+            <w:tcBorders>
+              <w:top w:val="single" w:sz="6" w:color="000000"/>
+              <w:bottom w:val="single" w:sz="6" w:color="000000"/>
+              <w:left w:val="nil" w:sz="6" w:color="000000"/>
+              <w:right w:val="nil" w:sz="6" w:color="000000"/>
+            </w:tcBorders>
+          </w:tcPr>
+          <w:p>
+            <w:pPr>
+              <w:jc w:val="center"/>
+            </w:pPr>
+            <w:r/>
+            <w:r>
+              <w:rPr>
+                <w:rFonts w:ascii="Times New Roman" w:hAnsi="Times New Roman"/>
+                <w:b/>
+                <w:sz w:val="18"/>
+              </w:rPr>
+              <w:t>Dia</w:t>
+            </w:r>
+          </w:p>
+        </w:tc>
+        <w:tc>
+          <w:tcPr>
+            <w:tcW w:type="dxa" w:w="3685"/>
+            <w:tcBorders>
+              <w:top w:val="single" w:sz="6" w:color="000000"/>
+              <w:bottom w:val="single" w:sz="6" w:color="000000"/>
+              <w:left w:val="nil" w:sz="6" w:color="000000"/>
+              <w:right w:val="nil" w:sz="6" w:color="000000"/>
+            </w:tcBorders>
+          </w:tcPr>
+          <w:p>
+            <w:pPr>
+              <w:jc w:val="center"/>
+            </w:pPr>
+            <w:r/>
+            <w:r>
+              <w:rPr>
+                <w:rFonts w:ascii="Times New Roman" w:hAnsi="Times New Roman"/>
+                <w:b/>
+                <w:sz w:val="18"/>
+              </w:rPr>
+              <w:t>Vigor</w:t>
+            </w:r>
+          </w:p>
+        </w:tc>
+        <w:tc>
+          <w:tcPr>
+            <w:tcW w:type="dxa" w:w="3685"/>
+            <w:tcBorders>
+              <w:top w:val="single" w:sz="6" w:color="000000"/>
+              <w:bottom w:val="single" w:sz="6" w:color="000000"/>
+              <w:left w:val="nil" w:sz="6" w:color="000000"/>
+              <w:right w:val="nil" w:sz="6" w:color="000000"/>
+            </w:tcBorders>
+          </w:tcPr>
+          <w:p>
+            <w:pPr>
+              <w:jc w:val="center"/>
+            </w:pPr>
+            <w:r/>
+            <w:r>
+              <w:rPr>
+                <w:rFonts w:ascii="Times New Roman" w:hAnsi="Times New Roman"/>
+                <w:b/>
+                <w:sz w:val="18"/>
+              </w:rPr>
+              <w:t>Fadiga</w:t>
+            </w:r>
+          </w:p>
+        </w:tc>
+      </w:tr>
+      <w:tr>
+        <w:tc>
+          <w:tcPr>
+            <w:tcW w:type="dxa" w:w="1701"/>
+            <w:tcBorders>
+              <w:top w:val="single" w:sz="6" w:color="000000"/>
+              <w:bottom w:val="single" w:sz="6" w:color="000000"/>
+              <w:left w:val="nil" w:sz="6" w:color="000000"/>
+              <w:right w:val="nil" w:sz="6" w:color="000000"/>
+            </w:tcBorders>
+          </w:tcPr>
+          <w:p>
+            <w:pPr>
+              <w:jc w:val="left"/>
+            </w:pPr>
+            <w:r/>
+            <w:r>
+              <w:rPr>
+                <w:rFonts w:ascii="Times New Roman" w:hAnsi="Times New Roman"/>
+                <w:sz w:val="18"/>
+              </w:rPr>
+              <w:t>Dia 1</w:t>
+            </w:r>
+          </w:p>
+        </w:tc>
+        <w:tc>
+          <w:tcPr>
+            <w:tcW w:type="dxa" w:w="3685"/>
+            <w:tcBorders>
+              <w:top w:val="single" w:sz="6" w:color="000000"/>
+              <w:bottom w:val="single" w:sz="6" w:color="000000"/>
+              <w:left w:val="nil" w:sz="6" w:color="000000"/>
+              <w:right w:val="nil" w:sz="6" w:color="000000"/>
+            </w:tcBorders>
+          </w:tcPr>
+          <w:p>
+            <w:pPr>
+              <w:jc w:val="center"/>
+            </w:pPr>
+            <w:r/>
+            <w:r>
+              <w:rPr>
+                <w:rFonts w:ascii="Times New Roman" w:hAnsi="Times New Roman"/>
+                <w:sz w:val="18"/>
+              </w:rPr>
+              <w:t>8,30</w:t>
+            </w:r>
+          </w:p>
+        </w:tc>
+        <w:tc>
+          <w:tcPr>
+            <w:tcW w:type="dxa" w:w="3685"/>
+            <w:tcBorders>
+              <w:top w:val="single" w:sz="6" w:color="000000"/>
+              <w:bottom w:val="single" w:sz="6" w:color="000000"/>
+              <w:left w:val="nil" w:sz="6" w:color="000000"/>
+              <w:right w:val="nil" w:sz="6" w:color="000000"/>
+            </w:tcBorders>
+          </w:tcPr>
+          <w:p>
+            <w:pPr>
+              <w:jc w:val="center"/>
+            </w:pPr>
+            <w:r/>
+            <w:r>
+              <w:rPr>
+                <w:rFonts w:ascii="Times New Roman" w:hAnsi="Times New Roman"/>
+                <w:sz w:val="18"/>
+              </w:rPr>
+              <w:t>3,37</w:t>
+            </w:r>
+          </w:p>
+        </w:tc>
+      </w:tr>
+      <w:tr>
+        <w:tc>
+          <w:tcPr>
+            <w:tcW w:type="dxa" w:w="1701"/>
+            <w:tcBorders>
+              <w:top w:val="single" w:sz="6" w:color="000000"/>
+              <w:bottom w:val="single" w:sz="6" w:color="000000"/>
+              <w:left w:val="nil" w:sz="6" w:color="000000"/>
+              <w:right w:val="nil" w:sz="6" w:color="000000"/>
+            </w:tcBorders>
+          </w:tcPr>
+          <w:p>
+            <w:pPr>
+              <w:jc w:val="left"/>
+            </w:pPr>
+            <w:r/>
+            <w:r>
+              <w:rPr>
+                <w:rFonts w:ascii="Times New Roman" w:hAnsi="Times New Roman"/>
+                <w:sz w:val="18"/>
+              </w:rPr>
+              <w:t>Dia 2</w:t>
+            </w:r>
+          </w:p>
+        </w:tc>
+        <w:tc>
+          <w:tcPr>
+            <w:tcW w:type="dxa" w:w="3685"/>
+            <w:tcBorders>
+              <w:top w:val="single" w:sz="6" w:color="000000"/>
+              <w:bottom w:val="single" w:sz="6" w:color="000000"/>
+              <w:left w:val="nil" w:sz="6" w:color="000000"/>
+              <w:right w:val="nil" w:sz="6" w:color="000000"/>
+            </w:tcBorders>
+          </w:tcPr>
+          <w:p>
+            <w:pPr>
+              <w:jc w:val="center"/>
+            </w:pPr>
+            <w:r/>
+            <w:r>
+              <w:rPr>
+                <w:rFonts w:ascii="Times New Roman" w:hAnsi="Times New Roman"/>
+                <w:sz w:val="18"/>
+              </w:rPr>
+              <w:t>5,45*</w:t>
+            </w:r>
+          </w:p>
+        </w:tc>
+        <w:tc>
+          <w:tcPr>
+            <w:tcW w:type="dxa" w:w="3685"/>
+            <w:tcBorders>
+              <w:top w:val="single" w:sz="6" w:color="000000"/>
+              <w:bottom w:val="single" w:sz="6" w:color="000000"/>
+              <w:left w:val="nil" w:sz="6" w:color="000000"/>
+              <w:right w:val="nil" w:sz="6" w:color="000000"/>
+            </w:tcBorders>
+          </w:tcPr>
+          <w:p>
+            <w:pPr>
+              <w:jc w:val="center"/>
+            </w:pPr>
+            <w:r/>
+            <w:r>
+              <w:rPr>
+                <w:rFonts w:ascii="Times New Roman" w:hAnsi="Times New Roman"/>
+                <w:sz w:val="18"/>
+              </w:rPr>
+              <w:t>5,18</w:t>
+            </w:r>
+          </w:p>
+        </w:tc>
+      </w:tr>
+      <w:tr>
+        <w:tc>
+          <w:tcPr>
+            <w:tcW w:type="dxa" w:w="1701"/>
+            <w:tcBorders>
+              <w:top w:val="single" w:sz="6" w:color="000000"/>
+              <w:bottom w:val="single" w:sz="6" w:color="000000"/>
+              <w:left w:val="nil" w:sz="6" w:color="000000"/>
+              <w:right w:val="nil" w:sz="6" w:color="000000"/>
+            </w:tcBorders>
+          </w:tcPr>
+          <w:p>
+            <w:pPr>
+              <w:jc w:val="left"/>
+            </w:pPr>
+            <w:r/>
+            <w:r>
+              <w:rPr>
+                <w:rFonts w:ascii="Times New Roman" w:hAnsi="Times New Roman"/>
+                <w:sz w:val="18"/>
+              </w:rPr>
+              <w:t>Dia 3</w:t>
+            </w:r>
+          </w:p>
+        </w:tc>
+        <w:tc>
+          <w:tcPr>
+            <w:tcW w:type="dxa" w:w="3685"/>
+            <w:tcBorders>
+              <w:top w:val="single" w:sz="6" w:color="000000"/>
+              <w:bottom w:val="single" w:sz="6" w:color="000000"/>
+              <w:left w:val="nil" w:sz="6" w:color="000000"/>
+              <w:right w:val="nil" w:sz="6" w:color="000000"/>
+            </w:tcBorders>
+          </w:tcPr>
+          <w:p>
+            <w:pPr>
+              <w:jc w:val="center"/>
+            </w:pPr>
+            <w:r/>
+            <w:r>
+              <w:rPr>
+                <w:rFonts w:ascii="Times New Roman" w:hAnsi="Times New Roman"/>
+                <w:sz w:val="18"/>
+              </w:rPr>
+              <w:t>5,65*</w:t>
+            </w:r>
+          </w:p>
+        </w:tc>
+        <w:tc>
+          <w:tcPr>
+            <w:tcW w:type="dxa" w:w="3685"/>
+            <w:tcBorders>
+              <w:top w:val="single" w:sz="6" w:color="000000"/>
+              <w:bottom w:val="single" w:sz="6" w:color="000000"/>
+              <w:left w:val="nil" w:sz="6" w:color="000000"/>
+              <w:right w:val="nil" w:sz="6" w:color="000000"/>
+            </w:tcBorders>
+          </w:tcPr>
+          <w:p>
+            <w:pPr>
+              <w:jc w:val="center"/>
+            </w:pPr>
+            <w:r/>
+            <w:r>
+              <w:rPr>
+                <w:rFonts w:ascii="Times New Roman" w:hAnsi="Times New Roman"/>
+                <w:sz w:val="18"/>
+              </w:rPr>
+              <w:t>4,84</w:t>
+            </w:r>
+          </w:p>
+        </w:tc>
+      </w:tr>
+      <w:tr>
+        <w:tc>
+          <w:tcPr>
+            <w:tcW w:type="dxa" w:w="1701"/>
+            <w:tcBorders>
+              <w:top w:val="single" w:sz="6" w:color="000000"/>
+              <w:bottom w:val="single" w:sz="6" w:color="000000"/>
+              <w:left w:val="nil" w:sz="6" w:color="000000"/>
+              <w:right w:val="nil" w:sz="6" w:color="000000"/>
+            </w:tcBorders>
+          </w:tcPr>
+          <w:p>
+            <w:pPr>
+              <w:jc w:val="left"/>
+            </w:pPr>
+            <w:r/>
+            <w:r>
+              <w:rPr>
+                <w:rFonts w:ascii="Times New Roman" w:hAnsi="Times New Roman"/>
+                <w:sz w:val="18"/>
+              </w:rPr>
+              <w:t>Dia 4</w:t>
+            </w:r>
+          </w:p>
+        </w:tc>
+        <w:tc>
+          <w:tcPr>
+            <w:tcW w:type="dxa" w:w="3685"/>
+            <w:tcBorders>
+              <w:top w:val="single" w:sz="6" w:color="000000"/>
+              <w:bottom w:val="single" w:sz="6" w:color="000000"/>
+              <w:left w:val="nil" w:sz="6" w:color="000000"/>
+              <w:right w:val="nil" w:sz="6" w:color="000000"/>
+            </w:tcBorders>
+          </w:tcPr>
+          <w:p>
+            <w:pPr>
+              <w:jc w:val="center"/>
+            </w:pPr>
+            <w:r/>
+            <w:r>
+              <w:rPr>
+                <w:rFonts w:ascii="Times New Roman" w:hAnsi="Times New Roman"/>
+                <w:sz w:val="18"/>
+              </w:rPr>
+              <w:t>5,31*</w:t>
+            </w:r>
+          </w:p>
+        </w:tc>
+        <w:tc>
+          <w:tcPr>
+            <w:tcW w:type="dxa" w:w="3685"/>
+            <w:tcBorders>
+              <w:top w:val="single" w:sz="6" w:color="000000"/>
+              <w:bottom w:val="single" w:sz="6" w:color="000000"/>
+              <w:left w:val="nil" w:sz="6" w:color="000000"/>
+              <w:right w:val="nil" w:sz="6" w:color="000000"/>
+            </w:tcBorders>
+          </w:tcPr>
+          <w:p>
+            <w:pPr>
+              <w:jc w:val="center"/>
+            </w:pPr>
+            <w:r/>
+            <w:r>
+              <w:rPr>
+                <w:rFonts w:ascii="Times New Roman" w:hAnsi="Times New Roman"/>
+                <w:sz w:val="18"/>
+              </w:rPr>
+              <w:t>5,70*</w:t>
+            </w:r>
+          </w:p>
+        </w:tc>
+      </w:tr>
+      <w:tr>
+        <w:tc>
+          <w:tcPr>
+            <w:tcW w:type="dxa" w:w="1701"/>
+            <w:tcBorders>
+              <w:top w:val="single" w:sz="6" w:color="000000"/>
+              <w:bottom w:val="single" w:sz="6" w:color="000000"/>
+              <w:left w:val="nil" w:sz="6" w:color="000000"/>
+              <w:right w:val="nil" w:sz="6" w:color="000000"/>
+            </w:tcBorders>
+          </w:tcPr>
+          <w:p>
+            <w:pPr>
+              <w:jc w:val="left"/>
+            </w:pPr>
+            <w:r/>
+            <w:r>
+              <w:rPr>
+                <w:rFonts w:ascii="Times New Roman" w:hAnsi="Times New Roman"/>
+                <w:sz w:val="18"/>
+              </w:rPr>
+              <w:t>Dia 5</w:t>
+            </w:r>
+          </w:p>
+        </w:tc>
+        <w:tc>
+          <w:tcPr>
+            <w:tcW w:type="dxa" w:w="3685"/>
+            <w:tcBorders>
+              <w:top w:val="single" w:sz="6" w:color="000000"/>
+              <w:bottom w:val="single" w:sz="6" w:color="000000"/>
+              <w:left w:val="nil" w:sz="6" w:color="000000"/>
+              <w:right w:val="nil" w:sz="6" w:color="000000"/>
+            </w:tcBorders>
+          </w:tcPr>
+          <w:p>
+            <w:pPr>
+              <w:jc w:val="center"/>
+            </w:pPr>
+            <w:r/>
+            <w:r>
+              <w:rPr>
+                <w:rFonts w:ascii="Times New Roman" w:hAnsi="Times New Roman"/>
+                <w:sz w:val="18"/>
+              </w:rPr>
+              <w:t>5,80*</w:t>
+            </w:r>
+          </w:p>
+        </w:tc>
+        <w:tc>
+          <w:tcPr>
+            <w:tcW w:type="dxa" w:w="3685"/>
+            <w:tcBorders>
+              <w:top w:val="single" w:sz="6" w:color="000000"/>
+              <w:bottom w:val="single" w:sz="6" w:color="000000"/>
+              <w:left w:val="nil" w:sz="6" w:color="000000"/>
+              <w:right w:val="nil" w:sz="6" w:color="000000"/>
+            </w:tcBorders>
+          </w:tcPr>
+          <w:p>
+            <w:pPr>
+              <w:jc w:val="center"/>
+            </w:pPr>
+            <w:r/>
+            <w:r>
+              <w:rPr>
+                <w:rFonts w:ascii="Times New Roman" w:hAnsi="Times New Roman"/>
+                <w:sz w:val="18"/>
+              </w:rPr>
+              <w:t>5,01</w:t>
+            </w:r>
+          </w:p>
+        </w:tc>
+      </w:tr>
+      <w:tr>
+        <w:tc>
+          <w:tcPr>
+            <w:tcW w:type="dxa" w:w="1701"/>
+            <w:tcBorders>
+              <w:top w:val="single" w:sz="6" w:color="000000"/>
+              <w:bottom w:val="single" w:sz="6" w:color="000000"/>
+              <w:left w:val="nil" w:sz="6" w:color="000000"/>
+              <w:right w:val="nil" w:sz="6" w:color="000000"/>
+            </w:tcBorders>
+          </w:tcPr>
+          <w:p>
+            <w:pPr>
+              <w:jc w:val="left"/>
+            </w:pPr>
+            <w:r/>
+            <w:r>
+              <w:rPr>
+                <w:rFonts w:ascii="Times New Roman" w:hAnsi="Times New Roman"/>
+                <w:sz w:val="18"/>
+              </w:rPr>
+              <w:t>Dia 6</w:t>
+            </w:r>
+          </w:p>
+        </w:tc>
+        <w:tc>
+          <w:tcPr>
+            <w:tcW w:type="dxa" w:w="3685"/>
+            <w:tcBorders>
+              <w:top w:val="single" w:sz="6" w:color="000000"/>
+              <w:bottom w:val="single" w:sz="6" w:color="000000"/>
+              <w:left w:val="nil" w:sz="6" w:color="000000"/>
+              <w:right w:val="nil" w:sz="6" w:color="000000"/>
+            </w:tcBorders>
+          </w:tcPr>
+          <w:p>
+            <w:pPr>
+              <w:jc w:val="center"/>
+            </w:pPr>
+            <w:r/>
+            <w:r>
+              <w:rPr>
+                <w:rFonts w:ascii="Times New Roman" w:hAnsi="Times New Roman"/>
+                <w:sz w:val="18"/>
+              </w:rPr>
+              <w:t>5,63*</w:t>
+            </w:r>
+          </w:p>
+        </w:tc>
+        <w:tc>
+          <w:tcPr>
+            <w:tcW w:type="dxa" w:w="3685"/>
+            <w:tcBorders>
+              <w:top w:val="single" w:sz="6" w:color="000000"/>
+              <w:bottom w:val="single" w:sz="6" w:color="000000"/>
+              <w:left w:val="nil" w:sz="6" w:color="000000"/>
+              <w:right w:val="nil" w:sz="6" w:color="000000"/>
+            </w:tcBorders>
+          </w:tcPr>
+          <w:p>
+            <w:pPr>
+              <w:jc w:val="center"/>
+            </w:pPr>
+            <w:r/>
+            <w:r>
+              <w:rPr>
+                <w:rFonts w:ascii="Times New Roman" w:hAnsi="Times New Roman"/>
+                <w:sz w:val="18"/>
+              </w:rPr>
+              <w:t>5,72*</w:t>
+            </w:r>
+          </w:p>
+        </w:tc>
+      </w:tr>
+      <w:tr>
+        <w:tc>
+          <w:tcPr>
+            <w:tcW w:type="dxa" w:w="1701"/>
+            <w:tcBorders>
+              <w:top w:val="single" w:sz="6" w:color="000000"/>
+              <w:bottom w:val="single" w:sz="6" w:color="000000"/>
+              <w:left w:val="nil" w:sz="6" w:color="000000"/>
+              <w:right w:val="nil" w:sz="6" w:color="000000"/>
+            </w:tcBorders>
+          </w:tcPr>
+          <w:p>
+            <w:pPr>
+              <w:jc w:val="left"/>
+            </w:pPr>
+            <w:r/>
+            <w:r>
+              <w:rPr>
+                <w:rFonts w:ascii="Times New Roman" w:hAnsi="Times New Roman"/>
+                <w:sz w:val="18"/>
+              </w:rPr>
+              <w:t>Dia 7</w:t>
+            </w:r>
+          </w:p>
+        </w:tc>
+        <w:tc>
+          <w:tcPr>
+            <w:tcW w:type="dxa" w:w="3685"/>
+            <w:tcBorders>
+              <w:top w:val="single" w:sz="6" w:color="000000"/>
+              <w:bottom w:val="single" w:sz="6" w:color="000000"/>
+              <w:left w:val="nil" w:sz="6" w:color="000000"/>
+              <w:right w:val="nil" w:sz="6" w:color="000000"/>
+            </w:tcBorders>
+          </w:tcPr>
+          <w:p>
+            <w:pPr>
+              <w:jc w:val="center"/>
+            </w:pPr>
+            <w:r/>
+            <w:r>
+              <w:rPr>
+                <w:rFonts w:ascii="Times New Roman" w:hAnsi="Times New Roman"/>
+                <w:sz w:val="18"/>
+              </w:rPr>
+              <w:t>4,10*</w:t>
+            </w:r>
+          </w:p>
+        </w:tc>
+        <w:tc>
+          <w:tcPr>
+            <w:tcW w:type="dxa" w:w="3685"/>
+            <w:tcBorders>
+              <w:top w:val="single" w:sz="6" w:color="000000"/>
+              <w:bottom w:val="single" w:sz="6" w:color="000000"/>
+              <w:left w:val="nil" w:sz="6" w:color="000000"/>
+              <w:right w:val="nil" w:sz="6" w:color="000000"/>
+            </w:tcBorders>
+          </w:tcPr>
+          <w:p>
+            <w:pPr>
+              <w:jc w:val="center"/>
+            </w:pPr>
+            <w:r/>
+            <w:r>
+              <w:rPr>
+                <w:rFonts w:ascii="Times New Roman" w:hAnsi="Times New Roman"/>
+                <w:sz w:val="18"/>
+              </w:rPr>
+              <w:t>6,93*</w:t>
+            </w:r>
+          </w:p>
+        </w:tc>
+      </w:tr>
+    </w:tbl>
+    <w:p>
+      <w:pPr>
+        <w:spacing w:after="0"/>
+      </w:pPr>
+      <w:r>
+        <w:rPr>
+          <w:i/>
+          <w:sz w:val="17"/>
+        </w:rPr>
+        <w:t>* diferença significativa em relação ao Dia 1 (Tukey, p &lt; 0,05).</w:t>
+      </w:r>
+    </w:p>
+    <w:p>
+      <w:pPr>
+        <w:spacing w:after="120"/>
+      </w:pPr>
+      <w:r>
+        <w:rPr>
+          <w:sz w:val="18"/>
+        </w:rPr>
+        <w:t>Fonte: dados da pesquisa (2026).</w:t>
+      </w:r>
+    </w:p>
+    <w:p>
+      <w:pPr>
+        <w:spacing w:before="120"/>
+        <w:jc w:val="center"/>
+      </w:pPr>
+      <w:r>
+        <w:drawing>
+          <wp:inline xmlns:a="http://schemas.openxmlformats.org/drawingml/2006/main" xmlns:pic="http://schemas.openxmlformats.org/drawingml/2006/picture">
+            <wp:extent cx="5220000" cy="2474667"/>
+            <wp:docPr id="6" name="Picture 6"/>
+            <wp:cNvGraphicFramePr>
+              <a:graphicFrameLocks noChangeAspect="1"/>
+            </wp:cNvGraphicFramePr>
+            <a:graphic>
+              <a:graphicData uri="http://schemas.openxmlformats.org/drawingml/2006/picture">
+                <pic:pic>
+                  <pic:nvPicPr>
+                    <pic:cNvPr id="0" name="ph_emm.png"/>
+                    <pic:cNvPicPr/>
+                  </pic:nvPicPr>
+                  <pic:blipFill>
+                    <a:blip r:embed="rId14"/>
+                    <a:stretch>
+                      <a:fillRect/>
+                    </a:stretch>
+                  </pic:blipFill>
+                  <pic:spPr>
+                    <a:xfrm>
+                      <a:off x="0" y="0"/>
+                      <a:ext cx="5220000" cy="2474667"/>
+                    </a:xfrm>
+                    <a:prstGeom prst="rect"/>
+                  </pic:spPr>
+                </pic:pic>
+              </a:graphicData>
+            </a:graphic>
+          </wp:inline>
+        </w:drawing>
+      </w:r>
+    </w:p>
+    <w:p>
+      <w:pPr>
+        <w:jc w:val="center"/>
+      </w:pPr>
+      <w:r>
+        <w:rPr>
+          <w:sz w:val="22"/>
+        </w:rPr>
+        <w:t>Figura 6 – Médias marginais diárias do vigor, da fadiga e da fadiga física, com comparação de todos os dias ao Dia 1 (* p &lt; 0,05).</w:t>
+      </w:r>
+    </w:p>
+    <w:p>
+      <w:pPr>
+        <w:spacing w:after="120"/>
+        <w:jc w:val="center"/>
+      </w:pPr>
+      <w:r>
+        <w:rPr>
+          <w:sz w:val="18"/>
+        </w:rPr>
+        <w:t>Fonte: elaboração dos autores (2026).</w:t>
+      </w:r>
+    </w:p>
+    <w:p>
+      <w:pPr>
+        <w:spacing w:before="120" w:after="80" w:line="360" w:lineRule="auto"/>
+      </w:pPr>
+      <w:r>
+        <w:rPr>
+          <w:b/>
+          <w:sz w:val="24"/>
+        </w:rPr>
+        <w:t>4.6 Variação entre pré e pós-treino (Wilcoxon)</w:t>
+      </w:r>
+    </w:p>
+    <w:p>
+      <w:pPr>
+        <w:spacing w:line="360" w:lineRule="auto" w:after="0"/>
+        <w:ind w:firstLine="709"/>
+        <w:jc w:val="both"/>
+      </w:pPr>
+      <w:r>
+        <w:rPr>
+          <w:b w:val="0"/>
+          <w:sz w:val="24"/>
+        </w:rPr>
+        <w:t>A comparação entre pré e pós-treino pelo teste de Wilcoxon (Tabela 9) evidenciou uma resposta aguda coerente com o esforço: o vigor caiu (d = -0,47) e a fadiga e a PTH subiram do momento pré para o pós, com efeito de magnitude pequena a moderada. Essa oscilação dentro do dia somou-se à tendência semanal e ajudou a compor o quadro de fadiga funcional observado no fim do microciclo.</w:t>
+      </w:r>
+    </w:p>
+    <w:p>
+      <w:pPr>
+        <w:spacing w:before="160" w:after="40"/>
+      </w:pPr>
+      <w:r>
+        <w:rPr>
+          <w:sz w:val="22"/>
+        </w:rPr>
+        <w:t>Tabela 9 – Comparação entre pré e pós-treino das dimensões do BRUMS e da PTH (teste de Wilcoxon e d de Cohen).</w:t>
       </w:r>
     </w:p>
     <w:tbl>
@@ -8133,7 +10300,7 @@
         <w:drawing>
           <wp:inline xmlns:a="http://schemas.openxmlformats.org/drawingml/2006/main" xmlns:pic="http://schemas.openxmlformats.org/drawingml/2006/picture">
             <wp:extent cx="5220000" cy="2936250"/>
-            <wp:docPr id="5" name="Picture 5"/>
+            <wp:docPr id="7" name="Picture 7"/>
             <wp:cNvGraphicFramePr>
               <a:graphicFrameLocks noChangeAspect="1"/>
             </wp:cNvGraphicFramePr>
@@ -8145,7 +10312,7 @@
                     <pic:cNvPicPr/>
                   </pic:nvPicPr>
                   <pic:blipFill>
-                    <a:blip r:embed="rId13"/>
+                    <a:blip r:embed="rId15"/>
                     <a:stretch>
                       <a:fillRect/>
                     </a:stretch>
@@ -8172,7 +10339,7 @@
         <w:rPr>
           <w:sz w:val="22"/>
         </w:rPr>
-        <w:t>Figura 5 – Escores de vigor, fadiga e perturbação total do humor no pré e no pós-treino, por dia.</w:t>
+        <w:t>Figura 7 – Escores de vigor, fadiga e perturbação total do humor no pré e no pós-treino, por dia.</w:t>
       </w:r>
     </w:p>
     <w:p>
@@ -8196,7 +10363,7 @@
           <w:b/>
           <w:sz w:val="24"/>
         </w:rPr>
-        <w:t>4.6 Relações entre as dimensões (Spearman)</w:t>
+        <w:t>4.7 Relações entre as dimensões (Spearman)</w:t>
       </w:r>
     </w:p>
     <w:p>
@@ -8210,7 +10377,7 @@
           <w:b w:val="0"/>
           <w:sz w:val="24"/>
         </w:rPr>
-        <w:t>As correlações de Spearman entre as dimensões (Tabela 7) mostraram que as dimensões negativas se associam entre si, com destaque para os pares depressão–raiva e tensão–confusão, e que a fadiga se relaciona com a depressão e a raiva. O vigor manteve-se relativamente independente das demais dimensões, o que reforça a sua leitura como um polo próprio do eixo energia–fadiga.</w:t>
+        <w:t>As correlações de Spearman entre as dimensões (Tabela 10) mostraram que as dimensões negativas se associam entre si, com destaque para os pares depressão–raiva e tensão–confusão, e que a fadiga se relaciona com a depressão e a raiva. O vigor manteve-se relativamente independente das demais dimensões, o que reforça a sua leitura como um polo próprio do eixo energia–fadiga.</w:t>
       </w:r>
     </w:p>
     <w:p>
@@ -8221,7 +10388,7 @@
         <w:rPr>
           <w:sz w:val="22"/>
         </w:rPr>
-        <w:t>Tabela 7 – Correlações de Spearman significativas entre as dimensões do BRUMS (n = 27 atletas).</w:t>
+        <w:t>Tabela 10 – Correlações de Spearman significativas entre as dimensões do BRUMS (n = 27 atletas).</w:t>
       </w:r>
     </w:p>
     <w:tbl>

</xml_diff>

<commit_message>
Scale the mood box-plot per variable in faceted panels
Rebuild the box-plot figure as six separate panels, one per BRUMS
dimension, each on its own value scale fitted to that variable's range so
every box reads clearly instead of being squeezed onto a shared 0-16 axis.
Keep the median and mean in each panel and align the reliability table
wording with its cells.

Co-Authored-By: Claude Opus 4.8 <noreply@anthropic.com>
Claude-Session: https://claude.ai/code/session_01P7yGiDeoGDyjWvPWQVsUrj
</commit_message>
<xml_diff>
--- a/Artigos/Paper1_Humor_resumido.docx
+++ b/Artigos/Paper1_Humor_resumido.docx
@@ -1140,7 +1140,7 @@
           <w:b w:val="0"/>
           <w:sz w:val="24"/>
         </w:rPr>
-        <w:t>A Figura 1 apresenta os diagramas de caixa das seis dimensões, em ordem canônica, com a mediana e a média de cada uma na mesma figura. O vigor e a fadiga ocupam a maior parte da escala e apresentam média e mediana próximas, sinal de distribuições razoavelmente simétricas, ao passo que as dimensões negativas se concentram junto ao zero, com a média acima da mediana, o que revela assimetria positiva e um efeito de piso.</w:t>
+        <w:t>A Figura 1 apresenta os diagramas de caixa das seis dimensões, em ordem canônica e em painéis separados, com a mediana e a média de cada uma. Como as dimensões diferem muito em amplitude, cada painel usa a escala da própria variável, o que torna a distribuição de cada uma mais legível. O vigor e a fadiga percorrem a maior parte da escala e apresentam média e mediana próximas, sinal de distribuições razoavelmente simétricas, ao passo que as dimensões negativas concentram a caixa junto ao zero e exibem a média acima da mediana, o que revela assimetria positiva e um efeito de piso.</w:t>
       </w:r>
     </w:p>
     <w:p>
@@ -1151,7 +1151,7 @@
       <w:r>
         <w:drawing>
           <wp:inline xmlns:a="http://schemas.openxmlformats.org/drawingml/2006/main" xmlns:pic="http://schemas.openxmlformats.org/drawingml/2006/picture">
-            <wp:extent cx="4680000" cy="1860000"/>
+            <wp:extent cx="4860000" cy="2243077"/>
             <wp:docPr id="1" name="Picture 1"/>
             <wp:cNvGraphicFramePr>
               <a:graphicFrameLocks noChangeAspect="1"/>
@@ -1172,7 +1172,7 @@
                   <pic:spPr>
                     <a:xfrm>
                       <a:off x="0" y="0"/>
-                      <a:ext cx="4680000" cy="1860000"/>
+                      <a:ext cx="4860000" cy="2243077"/>
                     </a:xfrm>
                     <a:prstGeom prst="rect"/>
                   </pic:spPr>
@@ -1191,7 +1191,7 @@
         <w:rPr>
           <w:sz w:val="22"/>
         </w:rPr>
-        <w:t>Figura 1 – Diagramas de caixa das seis dimensões do BRUMS, em ordem canônica, com a mediana (linha sólida) e a média (linha tracejada e losango) de cada dimensão.</w:t>
+        <w:t>Figura 1 – Diagramas de caixa das seis dimensões do BRUMS, em painéis separados e ordem canônica; cada painel usa a escala da própria variável, com a mediana (linha sólida) e a média (linha tracejada e losango).</w:t>
       </w:r>
     </w:p>
     <w:p>
@@ -1949,7 +1949,7 @@
           <w:i/>
           <w:sz w:val="17"/>
         </w:rPr>
-        <w:t>ICC(2,1) = medida isolada; ICC(2,k) = média das medidas. Consistência: &lt; 0,50 fraca; 0,50–0,75 moderada; &gt; 0,75 boa.</w:t>
+        <w:t>ICC(2,1) = medida isolada; ICC(2,k) = média das medidas. Consistência: &lt; 0,50 pobre; 0,50–0,75 moderada; &gt; 0,75 boa.</w:t>
       </w:r>
     </w:p>
     <w:p>
@@ -2450,7 +2450,7 @@
       <w:r>
         <w:drawing>
           <wp:inline xmlns:a="http://schemas.openxmlformats.org/drawingml/2006/main" xmlns:pic="http://schemas.openxmlformats.org/drawingml/2006/picture">
-            <wp:extent cx="5040000" cy="2741760"/>
+            <wp:extent cx="4500000" cy="2448000"/>
             <wp:docPr id="2" name="Picture 2"/>
             <wp:cNvGraphicFramePr>
               <a:graphicFrameLocks noChangeAspect="1"/>
@@ -2471,7 +2471,7 @@
                   <pic:spPr>
                     <a:xfrm>
                       <a:off x="0" y="0"/>
-                      <a:ext cx="5040000" cy="2741760"/>
+                      <a:ext cx="4500000" cy="2448000"/>
                     </a:xfrm>
                     <a:prstGeom prst="rect"/>
                   </pic:spPr>

</xml_diff>